<commit_message>
Update PCB et Datasheet PCB
</commit_message>
<xml_diff>
--- a/#100 Robot/#160 PCB/Datasheet PCB_Robotique_V3.docx
+++ b/#100 Robot/#160 PCB/Datasheet PCB_Robotique_V3.docx
@@ -24,13 +24,7 @@
     </w:p>
     <w:p>
       <w:r>
-        <w:t>Le PCB a p</w:t>
-      </w:r>
-      <w:r>
-        <w:t>o</w:t>
-      </w:r>
-      <w:r>
-        <w:t>ur but de faciliter les branchements sur la MY RIO.</w:t>
+        <w:t>Le PCB a pour but de faciliter les branchements sur la MY RIO.</w:t>
       </w:r>
     </w:p>
     <w:p>
@@ -47,10 +41,7 @@
         <w:t>vers l</w:t>
       </w:r>
       <w:r>
-        <w:t>es modules.</w:t>
-      </w:r>
-      <w:r>
-        <w:t xml:space="preserve"> Nous prenons soin de </w:t>
+        <w:t xml:space="preserve">es modules. Nous prenons soin de </w:t>
       </w:r>
       <w:r>
         <w:t xml:space="preserve">router les entrée/sorties </w:t>
@@ -116,22 +107,7 @@
         <w:t>Les files de Powers :</w:t>
       </w:r>
       <w:r>
-        <w:t xml:space="preserve"> 1</w:t>
-      </w:r>
-      <w:r>
-        <w:t>,0</w:t>
-      </w:r>
-      <w:r>
-        <w:t>16</w:t>
-      </w:r>
-      <w:r>
-        <w:t xml:space="preserve"> m</w:t>
-      </w:r>
-      <w:r>
-        <w:t>m</w:t>
-      </w:r>
-      <w:r>
-        <w:t xml:space="preserve"> = 0,040 Pouce</w:t>
+        <w:t xml:space="preserve"> 1,016 mm = 0,040 Pouce</w:t>
       </w:r>
     </w:p>
     <w:p>
@@ -158,10 +134,7 @@
         <w:t>Auto ;</w:t>
       </w:r>
       <w:r>
-        <w:t xml:space="preserve"> Drill = </w:t>
-      </w:r>
-      <w:r>
-        <w:t>0,024 Pouce</w:t>
+        <w:t xml:space="preserve"> Drill = 0,024 Pouce</w:t>
       </w:r>
     </w:p>
     <w:p>
@@ -519,30 +492,25 @@
       <w:r>
         <w:t xml:space="preserve">. Elles permettent de se connecter </w:t>
       </w:r>
+      <w:r>
+        <w:t>à</w:t>
+      </w:r>
+      <w:r>
+        <w:t xml:space="preserve"> la </w:t>
+      </w:r>
       <w:proofErr w:type="spellStart"/>
-      <w:proofErr w:type="gramStart"/>
-      <w:r>
-        <w:t>a</w:t>
+      <w:r>
+        <w:t>MyR</w:t>
+      </w:r>
+      <w:r>
+        <w:t>IO</w:t>
       </w:r>
       <w:proofErr w:type="spellEnd"/>
-      <w:proofErr w:type="gramEnd"/>
-      <w:r>
-        <w:t xml:space="preserve"> la MyR</w:t>
-      </w:r>
-      <w:r>
-        <w:t>IO</w:t>
-      </w:r>
       <w:r>
         <w:t xml:space="preserve"> sans </w:t>
       </w:r>
       <w:r>
-        <w:t xml:space="preserve">débrancher les nappes et/ou </w:t>
-      </w:r>
-      <w:r>
-        <w:t>faciliter l’ajout de nouveaux modules</w:t>
-      </w:r>
-      <w:r>
-        <w:t xml:space="preserve"> n’étant pas prévu au moment de la conception du PCB.</w:t>
+        <w:t>débrancher les nappes et/ou faciliter l’ajout de nouveaux modules n’étant pas prévu au moment de la conception du PCB.</w:t>
       </w:r>
     </w:p>
     <w:p>
@@ -757,6 +725,9 @@
         <w:spacing w:line="240" w:lineRule="auto"/>
       </w:pPr>
       <w:r>
+        <w:rPr>
+          <w:noProof/>
+        </w:rPr>
         <mc:AlternateContent>
           <mc:Choice Requires="wpg">
             <w:drawing>
@@ -1037,19 +1008,47 @@
       <w:pPr>
         <w:spacing w:line="240" w:lineRule="auto"/>
       </w:pPr>
-      <w:proofErr w:type="spellStart"/>
       <w:proofErr w:type="gramStart"/>
       <w:r>
-        <w:t>a</w:t>
-      </w:r>
-      <w:proofErr w:type="spellEnd"/>
+        <w:t>à</w:t>
+      </w:r>
       <w:proofErr w:type="gramEnd"/>
       <w:r>
         <w:t xml:space="preserve"> trois pins sur le PCB comme ci-contre.</w:t>
       </w:r>
     </w:p>
-    <w:p/>
-    <w:p/>
+    <w:p>
+      <w:pPr>
+        <w:spacing w:line="240" w:lineRule="auto"/>
+      </w:pPr>
+      <w:r>
+        <w:t xml:space="preserve">Les valeurs et calculs ont été sont issu de </w:t>
+      </w:r>
+    </w:p>
+    <w:p>
+      <w:pPr>
+        <w:spacing w:line="240" w:lineRule="auto"/>
+      </w:pPr>
+      <w:proofErr w:type="gramStart"/>
+      <w:r>
+        <w:t>la</w:t>
+      </w:r>
+      <w:proofErr w:type="gramEnd"/>
+      <w:r>
+        <w:t xml:space="preserve"> datasheet du composant </w:t>
+      </w:r>
+      <w:r>
+        <w:t>CNY70</w:t>
+      </w:r>
+      <w:r>
+        <w:t xml:space="preserve">. </w:t>
+      </w:r>
+    </w:p>
+    <w:p>
+      <w:pPr>
+        <w:spacing w:line="240" w:lineRule="auto"/>
+      </w:pPr>
+    </w:p>
     <w:p>
       <w:pPr>
         <w:pStyle w:val="Paragraphedeliste"/>
@@ -1126,15 +1125,13 @@
         <w:t xml:space="preserve"> du capteur</w:t>
       </w:r>
       <w:r>
-        <w:t xml:space="preserve">. La tension correspondante peut être obtenue en consultant </w:t>
-      </w:r>
-      <w:proofErr w:type="gramStart"/>
-      <w:r>
-        <w:t>le datasheet</w:t>
-      </w:r>
-      <w:proofErr w:type="gramEnd"/>
-      <w:r>
-        <w:t xml:space="preserve"> du composant. La caractéristique Id/Vd nous permet de trouver cette valeur</w:t>
+        <w:t>. La tension correspondante peut être obtenue en consultant l</w:t>
+      </w:r>
+      <w:r>
+        <w:t>a</w:t>
+      </w:r>
+      <w:r>
+        <w:t xml:space="preserve"> datasheet du composant. La caractéristique Id/Vd nous permet de trouver cette valeur</w:t>
       </w:r>
       <w:r>
         <w:t>.</w:t>
@@ -1195,7 +1192,7 @@
     </w:p>
     <w:p>
       <w:pPr>
-        <w:pStyle w:val="Paragraphedeliste"/>
+        <w:ind w:left="360"/>
       </w:pPr>
       <w:r>
         <w:rPr>
@@ -1207,12 +1204,12 @@
               <wp:anchor distT="0" distB="0" distL="114300" distR="114300" simplePos="0" relativeHeight="251661312" behindDoc="0" locked="0" layoutInCell="1" allowOverlap="1">
                 <wp:simplePos x="0" y="0"/>
                 <wp:positionH relativeFrom="column">
-                  <wp:posOffset>971338</wp:posOffset>
+                  <wp:posOffset>973455</wp:posOffset>
                 </wp:positionH>
                 <wp:positionV relativeFrom="paragraph">
-                  <wp:posOffset>10160</wp:posOffset>
+                  <wp:posOffset>298450</wp:posOffset>
                 </wp:positionV>
-                <wp:extent cx="1586443" cy="1600200"/>
+                <wp:extent cx="1586230" cy="1600200"/>
                 <wp:effectExtent l="0" t="0" r="0" b="0"/>
                 <wp:wrapNone/>
                 <wp:docPr id="24" name="Groupe 24"/>
@@ -1224,7 +1221,7 @@
                       <wpg:grpSpPr>
                         <a:xfrm>
                           <a:off x="0" y="0"/>
-                          <a:ext cx="1586443" cy="1600200"/>
+                          <a:ext cx="1586230" cy="1600200"/>
                           <a:chOff x="206797" y="0"/>
                           <a:chExt cx="1377730" cy="1299211"/>
                         </a:xfrm>
@@ -1471,7 +1468,23 @@
                                   <w:color w:val="000000" w:themeColor="text1"/>
                                   <w:kern w:val="24"/>
                                 </w:rPr>
-                                <w:t>PWM_Trape</w:t>
+                                <w:t>PWM_Trap</w:t>
+                              </w:r>
+                              <w:r>
+                                <w:rPr>
+                                  <w:rFonts w:asciiTheme="minorHAnsi" w:hAnsi="Calibri" w:cstheme="minorBidi"/>
+                                  <w:color w:val="000000" w:themeColor="text1"/>
+                                  <w:kern w:val="24"/>
+                                </w:rPr>
+                                <w:t>p</w:t>
+                              </w:r>
+                              <w:r>
+                                <w:rPr>
+                                  <w:rFonts w:asciiTheme="minorHAnsi" w:hAnsi="Calibri" w:cstheme="minorBidi"/>
+                                  <w:color w:val="000000" w:themeColor="text1"/>
+                                  <w:kern w:val="24"/>
+                                </w:rPr>
+                                <w:t>e</w:t>
                               </w:r>
                               <w:proofErr w:type="spellEnd"/>
                             </w:p>
@@ -1495,7 +1508,7 @@
           </mc:Choice>
           <mc:Fallback>
             <w:pict>
-              <v:group id="Groupe 24" o:spid="_x0000_s1031" style="position:absolute;left:0;text-align:left;margin-left:76.5pt;margin-top:.8pt;width:124.9pt;height:126pt;z-index:251661312;mso-width-relative:margin;mso-height-relative:margin" coordorigin="2067" coordsize="13777,12992" o:gfxdata="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">
+              <v:group id="Groupe 24" o:spid="_x0000_s1031" style="position:absolute;left:0;text-align:left;margin-left:76.65pt;margin-top:23.5pt;width:124.9pt;height:126pt;z-index:251661312;mso-width-relative:margin;mso-height-relative:margin" coordorigin="2067" coordsize="13777,12992" o:gfxdata="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">
                 <v:shape id="ZoneTexte 4" o:spid="_x0000_s1032" type="#_x0000_t202" style="position:absolute;left:10858;top:1010;width:3544;height:2770;rotation:-90;visibility:visible;mso-wrap-style:square;v-text-anchor:top" o:gfxdata="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" filled="f" stroked="f">
                   <v:textbox>
                     <w:txbxContent>
@@ -1620,7 +1633,23 @@
                             <w:color w:val="000000" w:themeColor="text1"/>
                             <w:kern w:val="24"/>
                           </w:rPr>
-                          <w:t>PWM_Trape</w:t>
+                          <w:t>PWM_Trap</w:t>
+                        </w:r>
+                        <w:r>
+                          <w:rPr>
+                            <w:rFonts w:asciiTheme="minorHAnsi" w:hAnsi="Calibri" w:cstheme="minorBidi"/>
+                            <w:color w:val="000000" w:themeColor="text1"/>
+                            <w:kern w:val="24"/>
+                          </w:rPr>
+                          <w:t>p</w:t>
+                        </w:r>
+                        <w:r>
+                          <w:rPr>
+                            <w:rFonts w:asciiTheme="minorHAnsi" w:hAnsi="Calibri" w:cstheme="minorBidi"/>
+                            <w:color w:val="000000" w:themeColor="text1"/>
+                            <w:kern w:val="24"/>
+                          </w:rPr>
+                          <w:t>e</w:t>
                         </w:r>
                         <w:proofErr w:type="spellEnd"/>
                       </w:p>
@@ -1632,6 +1661,23 @@
           </mc:Fallback>
         </mc:AlternateContent>
       </w:r>
+      <w:r>
+        <w:t>La trappe du trieur utilise un servo moteur de type SG90</w:t>
+      </w:r>
+    </w:p>
+    <w:p>
+      <w:pPr>
+        <w:ind w:left="360"/>
+      </w:pPr>
+      <w:r>
+        <w:t>Le manège du trieur utilise un servo moteur</w:t>
+      </w:r>
+      <w:r>
+        <w:t xml:space="preserve"> de type S4306R</w:t>
+      </w:r>
+      <w:r>
+        <w:t xml:space="preserve">   </w:t>
+      </w:r>
     </w:p>
     <w:p>
       <w:pPr>
@@ -1658,16 +1704,7 @@
         <w:pStyle w:val="Paragraphedeliste"/>
       </w:pPr>
     </w:p>
-    <w:p>
-      <w:pPr>
-        <w:pStyle w:val="Paragraphedeliste"/>
-      </w:pPr>
-    </w:p>
-    <w:p>
-      <w:pPr>
-        <w:pStyle w:val="Paragraphedeliste"/>
-      </w:pPr>
-    </w:p>
+    <w:p/>
     <w:p>
       <w:pPr>
         <w:pStyle w:val="Titre3"/>
@@ -1679,6 +1716,9 @@
     <w:p/>
     <w:p>
       <w:r>
+        <w:rPr>
+          <w:noProof/>
+        </w:rPr>
         <mc:AlternateContent>
           <mc:Choice Requires="wpg">
             <w:drawing>
@@ -1792,17 +1832,7 @@
                                   <w:sz w:val="20"/>
                                   <w:szCs w:val="20"/>
                                 </w:rPr>
-                                <w:t xml:space="preserve">   </w:t>
-                              </w:r>
-                              <w:r>
-                                <w:rPr>
-                                  <w:rFonts w:asciiTheme="minorHAnsi" w:hAnsi="Calibri" w:cstheme="minorBidi"/>
-                                  <w:color w:val="000000" w:themeColor="text1"/>
-                                  <w:kern w:val="24"/>
-                                  <w:sz w:val="20"/>
-                                  <w:szCs w:val="20"/>
-                                </w:rPr>
-                                <w:t>GND</w:t>
+                                <w:t xml:space="preserve">   GND</w:t>
                               </w:r>
                             </w:p>
                           </w:txbxContent>
@@ -1900,17 +1930,7 @@
                             <w:sz w:val="20"/>
                             <w:szCs w:val="20"/>
                           </w:rPr>
-                          <w:t xml:space="preserve">   </w:t>
-                        </w:r>
-                        <w:r>
-                          <w:rPr>
-                            <w:rFonts w:asciiTheme="minorHAnsi" w:hAnsi="Calibri" w:cstheme="minorBidi"/>
-                            <w:color w:val="000000" w:themeColor="text1"/>
-                            <w:kern w:val="24"/>
-                            <w:sz w:val="20"/>
-                            <w:szCs w:val="20"/>
-                          </w:rPr>
-                          <w:t>GND</w:t>
+                          <w:t xml:space="preserve">   GND</w:t>
                         </w:r>
                       </w:p>
                     </w:txbxContent>
@@ -1941,36 +1961,23 @@
         <w:t>Suiveur de Ligne</w:t>
       </w:r>
     </w:p>
-    <w:p/>
-    <w:p/>
-    <w:p/>
-    <w:p/>
-    <w:p/>
-    <w:p>
-      <w:pPr>
-        <w:pStyle w:val="Titre3"/>
-      </w:pPr>
-      <w:r>
-        <w:t>Lidar</w:t>
-      </w:r>
-    </w:p>
     <w:p>
       <w:r>
         <mc:AlternateContent>
           <mc:Choice Requires="wpg">
             <w:drawing>
-              <wp:anchor distT="0" distB="0" distL="114300" distR="114300" simplePos="0" relativeHeight="251667456" behindDoc="0" locked="0" layoutInCell="1" allowOverlap="1" wp14:anchorId="542AB8AB" wp14:editId="74545520">
+              <wp:anchor distT="0" distB="0" distL="114300" distR="114300" simplePos="0" relativeHeight="251673600" behindDoc="0" locked="0" layoutInCell="1" allowOverlap="1" wp14:anchorId="5BED8C10" wp14:editId="4323247E">
                 <wp:simplePos x="0" y="0"/>
                 <wp:positionH relativeFrom="column">
-                  <wp:posOffset>1534886</wp:posOffset>
+                  <wp:posOffset>1937535</wp:posOffset>
                 </wp:positionH>
                 <wp:positionV relativeFrom="paragraph">
-                  <wp:posOffset>6803</wp:posOffset>
+                  <wp:posOffset>38063</wp:posOffset>
                 </wp:positionV>
-                <wp:extent cx="1803376" cy="1913977"/>
-                <wp:effectExtent l="0" t="0" r="6985" b="0"/>
+                <wp:extent cx="807013" cy="1872420"/>
+                <wp:effectExtent l="0" t="0" r="0" b="0"/>
                 <wp:wrapNone/>
-                <wp:docPr id="36" name="Groupe 33">
+                <wp:docPr id="7" name="Groupe 1">
                   <a:extLst xmlns:a="http://schemas.openxmlformats.org/drawingml/2006/main"/>
                 </wp:docPr>
                 <wp:cNvGraphicFramePr/>
@@ -1981,20 +1988,79 @@
                       <wpg:grpSpPr>
                         <a:xfrm>
                           <a:off x="0" y="0"/>
-                          <a:ext cx="1803376" cy="1913977"/>
+                          <a:ext cx="807013" cy="1872420"/>
                           <a:chOff x="0" y="0"/>
-                          <a:chExt cx="1803376" cy="1913977"/>
+                          <a:chExt cx="807013" cy="1872420"/>
                         </a:xfrm>
                       </wpg:grpSpPr>
+                      <pic:pic xmlns:pic="http://schemas.openxmlformats.org/drawingml/2006/picture">
+                        <pic:nvPicPr>
+                          <pic:cNvPr id="9" name="Image 9">
+                            <a:extLst/>
+                          </pic:cNvPr>
+                          <pic:cNvPicPr/>
+                        </pic:nvPicPr>
+                        <pic:blipFill rotWithShape="1">
+                          <a:blip r:embed="rId8"/>
+                          <a:srcRect l="13214" t="80024" r="77881" b="5200"/>
+                          <a:stretch/>
+                        </pic:blipFill>
+                        <pic:spPr>
+                          <a:xfrm>
+                            <a:off x="23749" y="0"/>
+                            <a:ext cx="783264" cy="614144"/>
+                          </a:xfrm>
+                          <a:prstGeom prst="rect">
+                            <a:avLst/>
+                          </a:prstGeom>
+                        </pic:spPr>
+                      </pic:pic>
                       <wps:wsp>
-                        <wps:cNvPr id="37" name="ZoneTexte 4">
+                        <wps:cNvPr id="15" name="ZoneTexte 38">
                           <a:extLst/>
                         </wps:cNvPr>
                         <wps:cNvSpPr txBox="1"/>
                         <wps:spPr>
                           <a:xfrm rot="16200000">
-                            <a:off x="586023" y="161188"/>
-                            <a:ext cx="354329" cy="276999"/>
+                            <a:off x="430090" y="714068"/>
+                            <a:ext cx="476848" cy="276999"/>
+                          </a:xfrm>
+                          <a:prstGeom prst="rect">
+                            <a:avLst/>
+                          </a:prstGeom>
+                          <a:noFill/>
+                        </wps:spPr>
+                        <wps:txbx>
+                          <w:txbxContent>
+                            <w:p>
+                              <w:pPr>
+                                <w:pStyle w:val="NormalWeb"/>
+                                <w:spacing w:before="0" w:beforeAutospacing="0" w:after="0" w:afterAutospacing="0"/>
+                              </w:pPr>
+                              <w:r>
+                                <w:rPr>
+                                  <w:rFonts w:asciiTheme="minorHAnsi" w:hAnsi="Calibri" w:cstheme="minorBidi"/>
+                                  <w:color w:val="000000" w:themeColor="text1"/>
+                                  <w:kern w:val="24"/>
+                                </w:rPr>
+                                <w:t>GND</w:t>
+                              </w:r>
+                            </w:p>
+                          </w:txbxContent>
+                        </wps:txbx>
+                        <wps:bodyPr wrap="square" rtlCol="0">
+                          <a:spAutoFit/>
+                        </wps:bodyPr>
+                      </wps:wsp>
+                      <wps:wsp>
+                        <wps:cNvPr id="16" name="ZoneTexte 40">
+                          <a:extLst/>
+                        </wps:cNvPr>
+                        <wps:cNvSpPr txBox="1"/>
+                        <wps:spPr>
+                          <a:xfrm rot="16200000">
+                            <a:off x="291591" y="714068"/>
+                            <a:ext cx="476848" cy="276999"/>
                           </a:xfrm>
                           <a:prstGeom prst="rect">
                             <a:avLst/>
@@ -2015,6 +2081,275 @@
                                   <w:kern w:val="24"/>
                                 </w:rPr>
                                 <w:t>5V</w:t>
+                              </w:r>
+                            </w:p>
+                          </w:txbxContent>
+                        </wps:txbx>
+                        <wps:bodyPr wrap="square" rtlCol="0">
+                          <a:spAutoFit/>
+                        </wps:bodyPr>
+                      </wps:wsp>
+                      <wps:wsp>
+                        <wps:cNvPr id="64" name="ZoneTexte 48">
+                          <a:extLst/>
+                        </wps:cNvPr>
+                        <wps:cNvSpPr txBox="1"/>
+                        <wps:spPr>
+                          <a:xfrm rot="16200000">
+                            <a:off x="-299962" y="1105490"/>
+                            <a:ext cx="1244454" cy="276999"/>
+                          </a:xfrm>
+                          <a:prstGeom prst="rect">
+                            <a:avLst/>
+                          </a:prstGeom>
+                          <a:noFill/>
+                        </wps:spPr>
+                        <wps:txbx>
+                          <w:txbxContent>
+                            <w:p>
+                              <w:pPr>
+                                <w:pStyle w:val="NormalWeb"/>
+                                <w:spacing w:before="0" w:beforeAutospacing="0" w:after="0" w:afterAutospacing="0"/>
+                              </w:pPr>
+                              <w:r>
+                                <w:rPr>
+                                  <w:rFonts w:asciiTheme="minorHAnsi" w:hAnsi="Calibri" w:cstheme="minorBidi"/>
+                                  <w:color w:val="000000" w:themeColor="text1"/>
+                                  <w:kern w:val="24"/>
+                                </w:rPr>
+                                <w:t>SUIVEU_I2C_SCL</w:t>
+                              </w:r>
+                            </w:p>
+                          </w:txbxContent>
+                        </wps:txbx>
+                        <wps:bodyPr wrap="square" rtlCol="0">
+                          <a:spAutoFit/>
+                        </wps:bodyPr>
+                      </wps:wsp>
+                      <wps:wsp>
+                        <wps:cNvPr id="65" name="ZoneTexte 49">
+                          <a:extLst/>
+                        </wps:cNvPr>
+                        <wps:cNvSpPr txBox="1"/>
+                        <wps:spPr>
+                          <a:xfrm rot="16200000">
+                            <a:off x="-490640" y="1104781"/>
+                            <a:ext cx="1258279" cy="276999"/>
+                          </a:xfrm>
+                          <a:prstGeom prst="rect">
+                            <a:avLst/>
+                          </a:prstGeom>
+                          <a:noFill/>
+                        </wps:spPr>
+                        <wps:txbx>
+                          <w:txbxContent>
+                            <w:p>
+                              <w:pPr>
+                                <w:pStyle w:val="NormalWeb"/>
+                                <w:spacing w:before="0" w:beforeAutospacing="0" w:after="0" w:afterAutospacing="0"/>
+                              </w:pPr>
+                              <w:r>
+                                <w:rPr>
+                                  <w:rFonts w:asciiTheme="minorHAnsi" w:hAnsi="Calibri" w:cstheme="minorBidi"/>
+                                  <w:color w:val="000000" w:themeColor="text1"/>
+                                  <w:kern w:val="24"/>
+                                </w:rPr>
+                                <w:t>SUIVEU_I2C_SDA</w:t>
+                              </w:r>
+                            </w:p>
+                          </w:txbxContent>
+                        </wps:txbx>
+                        <wps:bodyPr wrap="square" rtlCol="0">
+                          <a:spAutoFit/>
+                        </wps:bodyPr>
+                      </wps:wsp>
+                    </wpg:wgp>
+                  </a:graphicData>
+                </a:graphic>
+              </wp:anchor>
+            </w:drawing>
+          </mc:Choice>
+          <mc:Fallback>
+            <w:pict>
+              <v:group w14:anchorId="5BED8C10" id="Groupe 1" o:spid="_x0000_s1043" style="position:absolute;margin-left:152.55pt;margin-top:3pt;width:63.55pt;height:147.45pt;z-index:251673600" coordsize="8070,18724" o:gfxdata="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">
+                <v:shape id="Image 9" o:spid="_x0000_s1044" type="#_x0000_t75" style="position:absolute;left:237;width:7833;height:6141;visibility:visible;mso-wrap-style:square" o:gfxdata="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">
+                  <v:imagedata r:id="rId13" o:title="" croptop="52445f" cropbottom="3408f" cropleft="8660f" cropright="51040f"/>
+                </v:shape>
+                <v:shape id="ZoneTexte 38" o:spid="_x0000_s1045" type="#_x0000_t202" style="position:absolute;left:4301;top:7140;width:4768;height:2770;rotation:-90;visibility:visible;mso-wrap-style:square;v-text-anchor:top" o:gfxdata="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" filled="f" stroked="f">
+                  <v:textbox style="mso-fit-shape-to-text:t">
+                    <w:txbxContent>
+                      <w:p>
+                        <w:pPr>
+                          <w:pStyle w:val="NormalWeb"/>
+                          <w:spacing w:before="0" w:beforeAutospacing="0" w:after="0" w:afterAutospacing="0"/>
+                        </w:pPr>
+                        <w:r>
+                          <w:rPr>
+                            <w:rFonts w:asciiTheme="minorHAnsi" w:hAnsi="Calibri" w:cstheme="minorBidi"/>
+                            <w:color w:val="000000" w:themeColor="text1"/>
+                            <w:kern w:val="24"/>
+                          </w:rPr>
+                          <w:t>GND</w:t>
+                        </w:r>
+                      </w:p>
+                    </w:txbxContent>
+                  </v:textbox>
+                </v:shape>
+                <v:shape id="ZoneTexte 40" o:spid="_x0000_s1046" type="#_x0000_t202" style="position:absolute;left:2916;top:7140;width:4768;height:2770;rotation:-90;visibility:visible;mso-wrap-style:square;v-text-anchor:top" o:gfxdata="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" filled="f" stroked="f">
+                  <v:textbox style="mso-fit-shape-to-text:t">
+                    <w:txbxContent>
+                      <w:p>
+                        <w:pPr>
+                          <w:pStyle w:val="NormalWeb"/>
+                          <w:spacing w:before="0" w:beforeAutospacing="0" w:after="0" w:afterAutospacing="0"/>
+                        </w:pPr>
+                        <w:r>
+                          <w:rPr>
+                            <w:rFonts w:asciiTheme="minorHAnsi" w:hAnsi="Calibri" w:cstheme="minorBidi"/>
+                            <w:color w:val="000000" w:themeColor="text1"/>
+                            <w:kern w:val="24"/>
+                          </w:rPr>
+                          <w:t>5V</w:t>
+                        </w:r>
+                      </w:p>
+                    </w:txbxContent>
+                  </v:textbox>
+                </v:shape>
+                <v:shape id="ZoneTexte 48" o:spid="_x0000_s1047" type="#_x0000_t202" style="position:absolute;left:-3001;top:11055;width:12445;height:2770;rotation:-90;visibility:visible;mso-wrap-style:square;v-text-anchor:top" o:gfxdata="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" filled="f" stroked="f">
+                  <v:textbox style="mso-fit-shape-to-text:t">
+                    <w:txbxContent>
+                      <w:p>
+                        <w:pPr>
+                          <w:pStyle w:val="NormalWeb"/>
+                          <w:spacing w:before="0" w:beforeAutospacing="0" w:after="0" w:afterAutospacing="0"/>
+                        </w:pPr>
+                        <w:r>
+                          <w:rPr>
+                            <w:rFonts w:asciiTheme="minorHAnsi" w:hAnsi="Calibri" w:cstheme="minorBidi"/>
+                            <w:color w:val="000000" w:themeColor="text1"/>
+                            <w:kern w:val="24"/>
+                          </w:rPr>
+                          <w:t>SUIVEU_I2C_SCL</w:t>
+                        </w:r>
+                      </w:p>
+                    </w:txbxContent>
+                  </v:textbox>
+                </v:shape>
+                <v:shape id="ZoneTexte 49" o:spid="_x0000_s1048" type="#_x0000_t202" style="position:absolute;left:-4907;top:11048;width:12583;height:2769;rotation:-90;visibility:visible;mso-wrap-style:square;v-text-anchor:top" o:gfxdata="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" filled="f" stroked="f">
+                  <v:textbox style="mso-fit-shape-to-text:t">
+                    <w:txbxContent>
+                      <w:p>
+                        <w:pPr>
+                          <w:pStyle w:val="NormalWeb"/>
+                          <w:spacing w:before="0" w:beforeAutospacing="0" w:after="0" w:afterAutospacing="0"/>
+                        </w:pPr>
+                        <w:r>
+                          <w:rPr>
+                            <w:rFonts w:asciiTheme="minorHAnsi" w:hAnsi="Calibri" w:cstheme="minorBidi"/>
+                            <w:color w:val="000000" w:themeColor="text1"/>
+                            <w:kern w:val="24"/>
+                          </w:rPr>
+                          <w:t>SUIVEU_I2C_SDA</w:t>
+                        </w:r>
+                      </w:p>
+                    </w:txbxContent>
+                  </v:textbox>
+                </v:shape>
+              </v:group>
+            </w:pict>
+          </mc:Fallback>
+        </mc:AlternateContent>
+      </w:r>
+    </w:p>
+    <w:p/>
+    <w:p/>
+    <w:p/>
+    <w:p/>
+    <w:p/>
+    <w:p/>
+    <w:p>
+      <w:pPr>
+        <w:pStyle w:val="Titre3"/>
+      </w:pPr>
+      <w:r>
+        <w:rPr>
+          <w:noProof/>
+        </w:rPr>
+        <mc:AlternateContent>
+          <mc:Choice Requires="wpg">
+            <w:drawing>
+              <wp:anchor distT="0" distB="0" distL="114300" distR="114300" simplePos="0" relativeHeight="251667456" behindDoc="0" locked="0" layoutInCell="1" allowOverlap="1" wp14:anchorId="542AB8AB" wp14:editId="74545520">
+                <wp:simplePos x="0" y="0"/>
+                <wp:positionH relativeFrom="column">
+                  <wp:posOffset>1487594</wp:posOffset>
+                </wp:positionH>
+                <wp:positionV relativeFrom="paragraph">
+                  <wp:posOffset>57996</wp:posOffset>
+                </wp:positionV>
+                <wp:extent cx="1802765" cy="2463165"/>
+                <wp:effectExtent l="0" t="0" r="6985" b="0"/>
+                <wp:wrapNone/>
+                <wp:docPr id="36" name="Groupe 33">
+                  <a:extLst xmlns:a="http://schemas.openxmlformats.org/drawingml/2006/main"/>
+                </wp:docPr>
+                <wp:cNvGraphicFramePr/>
+                <a:graphic xmlns:a="http://schemas.openxmlformats.org/drawingml/2006/main">
+                  <a:graphicData uri="http://schemas.microsoft.com/office/word/2010/wordprocessingGroup">
+                    <wpg:wgp>
+                      <wpg:cNvGrpSpPr/>
+                      <wpg:grpSpPr>
+                        <a:xfrm>
+                          <a:off x="0" y="0"/>
+                          <a:ext cx="1802765" cy="2463165"/>
+                          <a:chOff x="0" y="-549459"/>
+                          <a:chExt cx="1803376" cy="2463436"/>
+                        </a:xfrm>
+                      </wpg:grpSpPr>
+                      <wps:wsp>
+                        <wps:cNvPr id="37" name="ZoneTexte 4">
+                          <a:extLst/>
+                        </wps:cNvPr>
+                        <wps:cNvSpPr txBox="1"/>
+                        <wps:spPr>
+                          <a:xfrm rot="16200000">
+                            <a:off x="297413" y="-127425"/>
+                            <a:ext cx="960226" cy="277589"/>
+                          </a:xfrm>
+                          <a:prstGeom prst="rect">
+                            <a:avLst/>
+                          </a:prstGeom>
+                          <a:noFill/>
+                        </wps:spPr>
+                        <wps:txbx>
+                          <w:txbxContent>
+                            <w:p>
+                              <w:pPr>
+                                <w:pStyle w:val="NormalWeb"/>
+                                <w:spacing w:before="0" w:beforeAutospacing="0" w:after="0" w:afterAutospacing="0"/>
+                              </w:pPr>
+                              <w:r>
+                                <w:rPr>
+                                  <w:rFonts w:asciiTheme="minorHAnsi" w:hAnsi="Calibri" w:cstheme="minorBidi"/>
+                                  <w:color w:val="000000" w:themeColor="text1"/>
+                                  <w:kern w:val="24"/>
+                                </w:rPr>
+                                <w:t>VMOTO (</w:t>
+                              </w:r>
+                              <w:r>
+                                <w:rPr>
+                                  <w:rFonts w:asciiTheme="minorHAnsi" w:hAnsi="Calibri" w:cstheme="minorBidi"/>
+                                  <w:color w:val="000000" w:themeColor="text1"/>
+                                  <w:kern w:val="24"/>
+                                </w:rPr>
+                                <w:t>5</w:t>
+                              </w:r>
+                              <w:r>
+                                <w:rPr>
+                                  <w:rFonts w:asciiTheme="minorHAnsi" w:hAnsi="Calibri" w:cstheme="minorBidi"/>
+                                  <w:color w:val="000000" w:themeColor="text1"/>
+                                  <w:kern w:val="24"/>
+                                </w:rPr>
+                                <w:t>V)</w:t>
                               </w:r>
                             </w:p>
                           </w:txbxContent>
@@ -2089,8 +2424,8 @@
                         <wps:cNvSpPr txBox="1"/>
                         <wps:spPr>
                           <a:xfrm rot="16200000">
-                            <a:off x="724523" y="161187"/>
-                            <a:ext cx="354329" cy="276999"/>
+                            <a:off x="396844" y="-168142"/>
+                            <a:ext cx="1040130" cy="277495"/>
                           </a:xfrm>
                           <a:prstGeom prst="rect">
                             <a:avLst/>
@@ -2110,7 +2445,7 @@
                                   <w:color w:val="000000" w:themeColor="text1"/>
                                   <w:kern w:val="24"/>
                                 </w:rPr>
-                                <w:t>5V</w:t>
+                                <w:t>MOTOCTL</w:t>
                               </w:r>
                             </w:p>
                           </w:txbxContent>
@@ -2381,13 +2716,55 @@
                     </wpg:wgp>
                   </a:graphicData>
                 </a:graphic>
+                <wp14:sizeRelV relativeFrom="margin">
+                  <wp14:pctHeight>0</wp14:pctHeight>
+                </wp14:sizeRelV>
               </wp:anchor>
             </w:drawing>
           </mc:Choice>
           <mc:Fallback>
             <w:pict>
-              <v:group w14:anchorId="542AB8AB" id="Groupe 33" o:spid="_x0000_s1043" style="position:absolute;margin-left:120.85pt;margin-top:.55pt;width:142pt;height:150.7pt;z-index:251667456" coordsize="18033,19139" o:gfxdata="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">
-                <v:shape id="ZoneTexte 4" o:spid="_x0000_s1044" type="#_x0000_t202" style="position:absolute;left:5859;top:1612;width:3543;height:2770;rotation:-90;visibility:visible;mso-wrap-style:square;v-text-anchor:top" o:gfxdata="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" filled="f" stroked="f">
+              <v:group w14:anchorId="542AB8AB" id="Groupe 33" o:spid="_x0000_s1049" style="position:absolute;margin-left:117.15pt;margin-top:4.55pt;width:141.95pt;height:193.95pt;z-index:251667456;mso-height-relative:margin" coordorigin=",-5494" coordsize="18033,24634" o:gfxdata="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">
+                <v:shape id="ZoneTexte 4" o:spid="_x0000_s1050" type="#_x0000_t202" style="position:absolute;left:2974;top:-1274;width:9601;height:2776;rotation:-90;visibility:visible;mso-wrap-style:square;v-text-anchor:top" o:gfxdata="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" filled="f" stroked="f">
+                  <v:textbox style="mso-fit-shape-to-text:t">
+                    <w:txbxContent>
+                      <w:p>
+                        <w:pPr>
+                          <w:pStyle w:val="NormalWeb"/>
+                          <w:spacing w:before="0" w:beforeAutospacing="0" w:after="0" w:afterAutospacing="0"/>
+                        </w:pPr>
+                        <w:r>
+                          <w:rPr>
+                            <w:rFonts w:asciiTheme="minorHAnsi" w:hAnsi="Calibri" w:cstheme="minorBidi"/>
+                            <w:color w:val="000000" w:themeColor="text1"/>
+                            <w:kern w:val="24"/>
+                          </w:rPr>
+                          <w:t>VMOTO (</w:t>
+                        </w:r>
+                        <w:r>
+                          <w:rPr>
+                            <w:rFonts w:asciiTheme="minorHAnsi" w:hAnsi="Calibri" w:cstheme="minorBidi"/>
+                            <w:color w:val="000000" w:themeColor="text1"/>
+                            <w:kern w:val="24"/>
+                          </w:rPr>
+                          <w:t>5</w:t>
+                        </w:r>
+                        <w:r>
+                          <w:rPr>
+                            <w:rFonts w:asciiTheme="minorHAnsi" w:hAnsi="Calibri" w:cstheme="minorBidi"/>
+                            <w:color w:val="000000" w:themeColor="text1"/>
+                            <w:kern w:val="24"/>
+                          </w:rPr>
+                          <w:t>V)</w:t>
+                        </w:r>
+                      </w:p>
+                    </w:txbxContent>
+                  </v:textbox>
+                </v:shape>
+                <v:shape id="Image 38" o:spid="_x0000_s1051" type="#_x0000_t75" style="position:absolute;top:4832;width:18033;height:7118;visibility:visible;mso-wrap-style:square" o:gfxdata="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">
+                  <v:imagedata r:id="rId13" o:title="" croptop="52237f" cropbottom="3411f" cropleft="17446f" cropright="34293f"/>
+                </v:shape>
+                <v:shape id="ZoneTexte 24" o:spid="_x0000_s1052" type="#_x0000_t202" style="position:absolute;left:7244;top:12351;width:3543;height:2770;rotation:-90;visibility:visible;mso-wrap-style:square;v-text-anchor:top" o:gfxdata="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" filled="f" stroked="f">
                   <v:textbox style="mso-fit-shape-to-text:t">
                     <w:txbxContent>
                       <w:p>
@@ -2407,10 +2784,7 @@
                     </w:txbxContent>
                   </v:textbox>
                 </v:shape>
-                <v:shape id="Image 38" o:spid="_x0000_s1045" type="#_x0000_t75" style="position:absolute;top:4832;width:18033;height:7118;visibility:visible;mso-wrap-style:square" o:gfxdata="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">
-                  <v:imagedata r:id="rId13" o:title="" croptop="52237f" cropbottom="3411f" cropleft="17446f" cropright="34293f"/>
-                </v:shape>
-                <v:shape id="ZoneTexte 24" o:spid="_x0000_s1046" type="#_x0000_t202" style="position:absolute;left:7244;top:12351;width:3543;height:2770;rotation:-90;visibility:visible;mso-wrap-style:square;v-text-anchor:top" o:gfxdata="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" filled="f" stroked="f">
+                <v:shape id="ZoneTexte 25" o:spid="_x0000_s1053" type="#_x0000_t202" style="position:absolute;left:3969;top:-1682;width:10400;height:2775;rotation:-90;visibility:visible;mso-wrap-style:square;v-text-anchor:top" o:gfxdata="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" filled="f" stroked="f">
                   <v:textbox style="mso-fit-shape-to-text:t">
                     <w:txbxContent>
                       <w:p>
@@ -2424,33 +2798,13 @@
                             <w:color w:val="000000" w:themeColor="text1"/>
                             <w:kern w:val="24"/>
                           </w:rPr>
-                          <w:t>5V</w:t>
+                          <w:t>MOTOCTL</w:t>
                         </w:r>
                       </w:p>
                     </w:txbxContent>
                   </v:textbox>
                 </v:shape>
-                <v:shape id="ZoneTexte 25" o:spid="_x0000_s1047" type="#_x0000_t202" style="position:absolute;left:7244;top:1612;width:3543;height:2770;rotation:-90;visibility:visible;mso-wrap-style:square;v-text-anchor:top" o:gfxdata="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" filled="f" stroked="f">
-                  <v:textbox style="mso-fit-shape-to-text:t">
-                    <w:txbxContent>
-                      <w:p>
-                        <w:pPr>
-                          <w:pStyle w:val="NormalWeb"/>
-                          <w:spacing w:before="0" w:beforeAutospacing="0" w:after="0" w:afterAutospacing="0"/>
-                        </w:pPr>
-                        <w:r>
-                          <w:rPr>
-                            <w:rFonts w:asciiTheme="minorHAnsi" w:hAnsi="Calibri" w:cstheme="minorBidi"/>
-                            <w:color w:val="000000" w:themeColor="text1"/>
-                            <w:kern w:val="24"/>
-                          </w:rPr>
-                          <w:t>5V</w:t>
-                        </w:r>
-                      </w:p>
-                    </w:txbxContent>
-                  </v:textbox>
-                </v:shape>
-                <v:shape id="ZoneTexte 26" o:spid="_x0000_s1048" type="#_x0000_t202" style="position:absolute;left:8289;top:999;width:4768;height:2770;rotation:-90;visibility:visible;mso-wrap-style:square;v-text-anchor:top" o:gfxdata="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" filled="f" stroked="f">
+                <v:shape id="ZoneTexte 26" o:spid="_x0000_s1054" type="#_x0000_t202" style="position:absolute;left:8289;top:999;width:4768;height:2770;rotation:-90;visibility:visible;mso-wrap-style:square;v-text-anchor:top" o:gfxdata="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" filled="f" stroked="f">
                   <v:textbox style="mso-fit-shape-to-text:t">
                     <w:txbxContent>
                       <w:p>
@@ -2470,7 +2824,7 @@
                     </w:txbxContent>
                   </v:textbox>
                 </v:shape>
-                <v:shape id="ZoneTexte 27" o:spid="_x0000_s1049" type="#_x0000_t202" style="position:absolute;left:8197;top:13055;width:4952;height:2770;rotation:-90;visibility:visible;mso-wrap-style:square;v-text-anchor:top" o:gfxdata="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" filled="f" stroked="f">
+                <v:shape id="ZoneTexte 27" o:spid="_x0000_s1055" type="#_x0000_t202" style="position:absolute;left:8197;top:13055;width:4952;height:2770;rotation:-90;visibility:visible;mso-wrap-style:square;v-text-anchor:top" o:gfxdata="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" filled="f" stroked="f">
                   <v:textbox style="mso-fit-shape-to-text:t">
                     <w:txbxContent>
                       <w:p>
@@ -2490,7 +2844,7 @@
                     </w:txbxContent>
                   </v:textbox>
                 </v:shape>
-                <v:shape id="ZoneTexte 28" o:spid="_x0000_s1050" type="#_x0000_t202" style="position:absolute;left:3771;top:14167;width:7175;height:2770;rotation:-90;visibility:visible;mso-wrap-style:square;v-text-anchor:top" o:gfxdata="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" filled="f" stroked="f">
+                <v:shape id="ZoneTexte 28" o:spid="_x0000_s1056" type="#_x0000_t202" style="position:absolute;left:3771;top:14167;width:7175;height:2770;rotation:-90;visibility:visible;mso-wrap-style:square;v-text-anchor:top" o:gfxdata="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" filled="f" stroked="f">
                   <v:textbox style="mso-fit-shape-to-text:t">
                     <w:txbxContent>
                       <w:p>
@@ -2510,7 +2864,7 @@
                     </w:txbxContent>
                   </v:textbox>
                 </v:shape>
-                <v:shape id="ZoneTexte 29" o:spid="_x0000_s1051" type="#_x0000_t202" style="position:absolute;left:2114;top:14167;width:7175;height:2770;rotation:-90;visibility:visible;mso-wrap-style:square;v-text-anchor:top" o:gfxdata="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" filled="f" stroked="f">
+                <v:shape id="ZoneTexte 29" o:spid="_x0000_s1057" type="#_x0000_t202" style="position:absolute;left:2114;top:14167;width:7175;height:2770;rotation:-90;visibility:visible;mso-wrap-style:square;v-text-anchor:top" o:gfxdata="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" filled="f" stroked="f">
                   <v:textbox style="mso-fit-shape-to-text:t">
                     <w:txbxContent>
                       <w:p>
@@ -2530,7 +2884,7 @@
                     </w:txbxContent>
                   </v:textbox>
                 </v:shape>
-                <v:shape id="ZoneTexte 30" o:spid="_x0000_s1052" type="#_x0000_t202" style="position:absolute;left:2044;top:12515;width:4001;height:2770;rotation:-90;visibility:visible;mso-wrap-style:square;v-text-anchor:top" o:gfxdata="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" filled="f" stroked="f">
+                <v:shape id="ZoneTexte 30" o:spid="_x0000_s1058" type="#_x0000_t202" style="position:absolute;left:2044;top:12515;width:4001;height:2770;rotation:-90;visibility:visible;mso-wrap-style:square;v-text-anchor:top" o:gfxdata="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" filled="f" stroked="f">
                   <v:textbox style="mso-fit-shape-to-text:t">
                     <w:txbxContent>
                       <w:p>
@@ -2550,7 +2904,7 @@
                     </w:txbxContent>
                   </v:textbox>
                 </v:shape>
-                <v:shape id="ZoneTexte 31" o:spid="_x0000_s1053" type="#_x0000_t202" style="position:absolute;left:3973;top:1441;width:4001;height:2770;rotation:-90;visibility:visible;mso-wrap-style:square;v-text-anchor:top" o:gfxdata="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" filled="f" stroked="f">
+                <v:shape id="ZoneTexte 31" o:spid="_x0000_s1059" type="#_x0000_t202" style="position:absolute;left:3973;top:1441;width:4001;height:2770;rotation:-90;visibility:visible;mso-wrap-style:square;v-text-anchor:top" o:gfxdata="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" filled="f" stroked="f">
                   <v:textbox style="mso-fit-shape-to-text:t">
                     <w:txbxContent>
                       <w:p>
@@ -2570,7 +2924,7 @@
                     </w:txbxContent>
                   </v:textbox>
                 </v:shape>
-                <v:shape id="ZoneTexte 32" o:spid="_x0000_s1054" type="#_x0000_t202" style="position:absolute;left:2316;top:1441;width:4001;height:2770;rotation:-90;visibility:visible;mso-wrap-style:square;v-text-anchor:top" o:gfxdata="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" filled="f" stroked="f">
+                <v:shape id="ZoneTexte 32" o:spid="_x0000_s1060" type="#_x0000_t202" style="position:absolute;left:2316;top:1441;width:4001;height:2770;rotation:-90;visibility:visible;mso-wrap-style:square;v-text-anchor:top" o:gfxdata="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" filled="f" stroked="f">
                   <v:textbox style="mso-fit-shape-to-text:t">
                     <w:txbxContent>
                       <w:p>
@@ -2595,6 +2949,9 @@
           </mc:Fallback>
         </mc:AlternateContent>
       </w:r>
+      <w:r>
+        <w:t>Lidar</w:t>
+      </w:r>
     </w:p>
     <w:p/>
     <w:p/>
@@ -2602,6 +2959,8 @@
     <w:p/>
     <w:p/>
     <w:p/>
+    <w:p/>
+    <w:p/>
     <w:p>
       <w:pPr>
         <w:pStyle w:val="Titre3"/>
@@ -2611,17 +2970,23 @@
       </w:r>
     </w:p>
     <w:p>
-      <w:r>
+      <w:pPr>
+        <w:ind w:left="360"/>
+      </w:pPr>
+      <w:r>
+        <w:rPr>
+          <w:noProof/>
+        </w:rPr>
         <mc:AlternateContent>
           <mc:Choice Requires="wpg">
             <w:drawing>
               <wp:anchor distT="0" distB="0" distL="114300" distR="114300" simplePos="0" relativeHeight="251669504" behindDoc="0" locked="0" layoutInCell="1" allowOverlap="1" wp14:anchorId="3FCCED14" wp14:editId="33AFFA0C">
                 <wp:simplePos x="0" y="0"/>
                 <wp:positionH relativeFrom="margin">
-                  <wp:posOffset>1605189</wp:posOffset>
+                  <wp:posOffset>1462405</wp:posOffset>
                 </wp:positionH>
                 <wp:positionV relativeFrom="paragraph">
-                  <wp:posOffset>242570</wp:posOffset>
+                  <wp:posOffset>289074</wp:posOffset>
                 </wp:positionV>
                 <wp:extent cx="2103120" cy="1043940"/>
                 <wp:effectExtent l="0" t="0" r="0" b="3810"/>
@@ -2811,9 +3176,9 @@
           </mc:Choice>
           <mc:Fallback>
             <w:pict>
-              <v:group w14:anchorId="3FCCED14" id="Groupe 38" o:spid="_x0000_s1055" style="position:absolute;margin-left:126.4pt;margin-top:19.1pt;width:165.6pt;height:82.2pt;z-index:251669504;mso-position-horizontal-relative:margin;mso-width-relative:margin;mso-height-relative:margin" coordsize="14224,6939" o:gfxdata="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">
-                <v:group id="Groupe 49" o:spid="_x0000_s1056" style="position:absolute;width:7129;height:6939" coordorigin="" coordsize="7129,6939" o:gfxdata="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">
-                  <v:shape id="ZoneTexte 6" o:spid="_x0000_s1057" type="#_x0000_t202" style="position:absolute;width:4546;height:2462;visibility:visible;mso-wrap-style:square;v-text-anchor:top" o:gfxdata="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" filled="f" stroked="f">
+              <v:group w14:anchorId="3FCCED14" id="Groupe 38" o:spid="_x0000_s1061" style="position:absolute;left:0;text-align:left;margin-left:115.15pt;margin-top:22.75pt;width:165.6pt;height:82.2pt;z-index:251669504;mso-position-horizontal-relative:margin;mso-width-relative:margin;mso-height-relative:margin" coordsize="14224,6939" o:gfxdata="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">
+                <v:group id="Groupe 49" o:spid="_x0000_s1062" style="position:absolute;width:7129;height:6939" coordorigin="" coordsize="7129,6939" o:gfxdata="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">
+                  <v:shape id="ZoneTexte 6" o:spid="_x0000_s1063" type="#_x0000_t202" style="position:absolute;width:4546;height:2462;visibility:visible;mso-wrap-style:square;v-text-anchor:top" o:gfxdata="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" filled="f" stroked="f">
                     <v:textbox>
                       <w:txbxContent>
                         <w:p>
@@ -2835,10 +3200,10 @@
                       </w:txbxContent>
                     </v:textbox>
                   </v:shape>
-                  <v:shape id="Image 51" o:spid="_x0000_s1058" type="#_x0000_t75" style="position:absolute;left:2392;top:2049;width:4737;height:4890;visibility:visible;mso-wrap-style:square" o:gfxdata="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">
+                  <v:shape id="Image 51" o:spid="_x0000_s1064" type="#_x0000_t75" style="position:absolute;left:2392;top:2049;width:4737;height:4890;visibility:visible;mso-wrap-style:square" o:gfxdata="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">
                     <v:imagedata r:id="rId13" o:title="" croptop=".5" cropbottom="22418f" cropleft="24980f" cropright="35763f"/>
                   </v:shape>
-                  <v:shape id="ZoneTexte 35" o:spid="_x0000_s1059" type="#_x0000_t202" style="position:absolute;left:3079;width:3468;height:2462;visibility:visible;mso-wrap-style:square;v-text-anchor:top" o:gfxdata="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" filled="f" stroked="f">
+                  <v:shape id="ZoneTexte 35" o:spid="_x0000_s1065" type="#_x0000_t202" style="position:absolute;left:3079;width:3468;height:2462;visibility:visible;mso-wrap-style:square;v-text-anchor:top" o:gfxdata="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" filled="f" stroked="f">
                     <v:textbox>
                       <w:txbxContent>
                         <w:p>
@@ -2861,7 +3226,7 @@
                     </v:textbox>
                   </v:shape>
                 </v:group>
-                <v:shape id="ZoneTexte 36" o:spid="_x0000_s1060" type="#_x0000_t202" style="position:absolute;left:5397;width:8827;height:2462;visibility:visible;mso-wrap-style:square;v-text-anchor:top" o:gfxdata="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" filled="f" stroked="f">
+                <v:shape id="ZoneTexte 36" o:spid="_x0000_s1066" type="#_x0000_t202" style="position:absolute;left:5397;width:8827;height:2462;visibility:visible;mso-wrap-style:square;v-text-anchor:top" o:gfxdata="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" filled="f" stroked="f">
                   <v:textbox>
                     <w:txbxContent>
                       <w:p>
@@ -2891,6 +3256,28 @@
           </mc:Fallback>
         </mc:AlternateContent>
       </w:r>
+      <w:r>
+        <w:t xml:space="preserve">Le bras du robot utilise un servo moteur de type </w:t>
+      </w:r>
+      <w:proofErr w:type="spellStart"/>
+      <w:r>
+        <w:t>Parallax</w:t>
+      </w:r>
+      <w:proofErr w:type="spellEnd"/>
+      <w:r>
+        <w:t xml:space="preserve"> Standard Servo (#900-00005) </w:t>
+      </w:r>
+      <w:proofErr w:type="spellStart"/>
+      <w:r>
+        <w:t>controlé</w:t>
+      </w:r>
+      <w:proofErr w:type="spellEnd"/>
+      <w:r>
+        <w:t xml:space="preserve"> en angles sur 180°.</w:t>
+      </w:r>
+      <w:r>
+        <w:t xml:space="preserve">  </w:t>
+      </w:r>
     </w:p>
     <w:p/>
     <w:p/>
@@ -2909,21 +3296,894 @@
       <w:r>
         <w:t xml:space="preserve"> des</w:t>
       </w:r>
+      <w:r>
+        <w:t xml:space="preserve"> Roues</w:t>
+      </w:r>
+    </w:p>
+    <w:p>
+      <w:r>
+        <mc:AlternateContent>
+          <mc:Choice Requires="wpg">
+            <w:drawing>
+              <wp:anchor distT="0" distB="0" distL="114300" distR="114300" simplePos="0" relativeHeight="251675648" behindDoc="0" locked="0" layoutInCell="1" allowOverlap="1" wp14:anchorId="68E18DCA" wp14:editId="20CF9D89">
+                <wp:simplePos x="0" y="0"/>
+                <wp:positionH relativeFrom="column">
+                  <wp:posOffset>1562100</wp:posOffset>
+                </wp:positionH>
+                <wp:positionV relativeFrom="paragraph">
+                  <wp:posOffset>142875</wp:posOffset>
+                </wp:positionV>
+                <wp:extent cx="3459733" cy="2032726"/>
+                <wp:effectExtent l="0" t="0" r="0" b="5715"/>
+                <wp:wrapNone/>
+                <wp:docPr id="82" name="Groupe 2">
+                  <a:extLst xmlns:a="http://schemas.openxmlformats.org/drawingml/2006/main"/>
+                </wp:docPr>
+                <wp:cNvGraphicFramePr/>
+                <a:graphic xmlns:a="http://schemas.openxmlformats.org/drawingml/2006/main">
+                  <a:graphicData uri="http://schemas.microsoft.com/office/word/2010/wordprocessingGroup">
+                    <wpg:wgp>
+                      <wpg:cNvGrpSpPr/>
+                      <wpg:grpSpPr>
+                        <a:xfrm>
+                          <a:off x="0" y="0"/>
+                          <a:ext cx="3459733" cy="2032726"/>
+                          <a:chOff x="0" y="0"/>
+                          <a:chExt cx="3459733" cy="2032726"/>
+                        </a:xfrm>
+                      </wpg:grpSpPr>
+                      <pic:pic xmlns:pic="http://schemas.openxmlformats.org/drawingml/2006/picture">
+                        <pic:nvPicPr>
+                          <pic:cNvPr id="83" name="Image 83">
+                            <a:extLst/>
+                          </pic:cNvPr>
+                          <pic:cNvPicPr/>
+                        </pic:nvPicPr>
+                        <pic:blipFill rotWithShape="1">
+                          <a:blip r:embed="rId8"/>
+                          <a:srcRect l="2197" t="50780" r="90192" b="4675"/>
+                          <a:stretch/>
+                        </pic:blipFill>
+                        <pic:spPr>
+                          <a:xfrm>
+                            <a:off x="465044" y="0"/>
+                            <a:ext cx="716309" cy="2032726"/>
+                          </a:xfrm>
+                          <a:prstGeom prst="rect">
+                            <a:avLst/>
+                          </a:prstGeom>
+                        </pic:spPr>
+                      </pic:pic>
+                      <wps:wsp>
+                        <wps:cNvPr id="84" name="ZoneTexte 56">
+                          <a:extLst/>
+                        </wps:cNvPr>
+                        <wps:cNvSpPr txBox="1"/>
+                        <wps:spPr>
+                          <a:xfrm>
+                            <a:off x="56972" y="299755"/>
+                            <a:ext cx="411561" cy="276999"/>
+                          </a:xfrm>
+                          <a:prstGeom prst="rect">
+                            <a:avLst/>
+                          </a:prstGeom>
+                          <a:noFill/>
+                        </wps:spPr>
+                        <wps:txbx>
+                          <w:txbxContent>
+                            <w:p>
+                              <w:pPr>
+                                <w:pStyle w:val="NormalWeb"/>
+                                <w:spacing w:before="0" w:beforeAutospacing="0" w:after="0" w:afterAutospacing="0"/>
+                              </w:pPr>
+                              <w:r>
+                                <w:rPr>
+                                  <w:rFonts w:asciiTheme="minorHAnsi" w:hAnsi="Calibri" w:cstheme="minorBidi"/>
+                                  <w:color w:val="000000" w:themeColor="text1"/>
+                                  <w:kern w:val="24"/>
+                                </w:rPr>
+                                <w:t>NC</w:t>
+                              </w:r>
+                            </w:p>
+                          </w:txbxContent>
+                        </wps:txbx>
+                        <wps:bodyPr wrap="square" rtlCol="0">
+                          <a:spAutoFit/>
+                        </wps:bodyPr>
+                      </wps:wsp>
+                      <wps:wsp>
+                        <wps:cNvPr id="85" name="ZoneTexte 57">
+                          <a:extLst/>
+                        </wps:cNvPr>
+                        <wps:cNvSpPr txBox="1"/>
+                        <wps:spPr>
+                          <a:xfrm>
+                            <a:off x="94231" y="485175"/>
+                            <a:ext cx="411561" cy="276999"/>
+                          </a:xfrm>
+                          <a:prstGeom prst="rect">
+                            <a:avLst/>
+                          </a:prstGeom>
+                          <a:noFill/>
+                        </wps:spPr>
+                        <wps:txbx>
+                          <w:txbxContent>
+                            <w:p>
+                              <w:pPr>
+                                <w:pStyle w:val="NormalWeb"/>
+                                <w:spacing w:before="0" w:beforeAutospacing="0" w:after="0" w:afterAutospacing="0"/>
+                              </w:pPr>
+                              <w:r>
+                                <w:rPr>
+                                  <w:rFonts w:asciiTheme="minorHAnsi" w:hAnsi="Calibri" w:cstheme="minorBidi"/>
+                                  <w:color w:val="000000" w:themeColor="text1"/>
+                                  <w:kern w:val="24"/>
+                                </w:rPr>
+                                <w:t>5V</w:t>
+                              </w:r>
+                            </w:p>
+                          </w:txbxContent>
+                        </wps:txbx>
+                        <wps:bodyPr wrap="square" rtlCol="0">
+                          <a:spAutoFit/>
+                        </wps:bodyPr>
+                      </wps:wsp>
+                      <wps:wsp>
+                        <wps:cNvPr id="86" name="ZoneTexte 58">
+                          <a:extLst/>
+                        </wps:cNvPr>
+                        <wps:cNvSpPr txBox="1"/>
+                        <wps:spPr>
+                          <a:xfrm>
+                            <a:off x="0" y="678250"/>
+                            <a:ext cx="482209" cy="276999"/>
+                          </a:xfrm>
+                          <a:prstGeom prst="rect">
+                            <a:avLst/>
+                          </a:prstGeom>
+                          <a:noFill/>
+                        </wps:spPr>
+                        <wps:txbx>
+                          <w:txbxContent>
+                            <w:p>
+                              <w:pPr>
+                                <w:pStyle w:val="NormalWeb"/>
+                                <w:spacing w:before="0" w:beforeAutospacing="0" w:after="0" w:afterAutospacing="0"/>
+                              </w:pPr>
+                              <w:r>
+                                <w:rPr>
+                                  <w:rFonts w:asciiTheme="minorHAnsi" w:hAnsi="Calibri" w:cstheme="minorBidi"/>
+                                  <w:color w:val="000000" w:themeColor="text1"/>
+                                  <w:kern w:val="24"/>
+                                </w:rPr>
+                                <w:t>GND</w:t>
+                              </w:r>
+                            </w:p>
+                          </w:txbxContent>
+                        </wps:txbx>
+                        <wps:bodyPr wrap="square" rtlCol="0">
+                          <a:spAutoFit/>
+                        </wps:bodyPr>
+                      </wps:wsp>
+                      <wps:wsp>
+                        <wps:cNvPr id="87" name="ZoneTexte 59">
+                          <a:extLst/>
+                        </wps:cNvPr>
+                        <wps:cNvSpPr txBox="1"/>
+                        <wps:spPr>
+                          <a:xfrm>
+                            <a:off x="62811" y="870184"/>
+                            <a:ext cx="482209" cy="276999"/>
+                          </a:xfrm>
+                          <a:prstGeom prst="rect">
+                            <a:avLst/>
+                          </a:prstGeom>
+                          <a:noFill/>
+                        </wps:spPr>
+                        <wps:txbx>
+                          <w:txbxContent>
+                            <w:p>
+                              <w:pPr>
+                                <w:pStyle w:val="NormalWeb"/>
+                                <w:spacing w:before="0" w:beforeAutospacing="0" w:after="0" w:afterAutospacing="0"/>
+                              </w:pPr>
+                              <w:r>
+                                <w:rPr>
+                                  <w:rFonts w:asciiTheme="minorHAnsi" w:hAnsi="Calibri" w:cstheme="minorBidi"/>
+                                  <w:color w:val="000000" w:themeColor="text1"/>
+                                  <w:kern w:val="24"/>
+                                </w:rPr>
+                                <w:t>NC</w:t>
+                              </w:r>
+                            </w:p>
+                          </w:txbxContent>
+                        </wps:txbx>
+                        <wps:bodyPr wrap="square" rtlCol="0">
+                          <a:spAutoFit/>
+                        </wps:bodyPr>
+                      </wps:wsp>
+                      <wps:wsp>
+                        <wps:cNvPr id="88" name="ZoneTexte 60">
+                          <a:extLst/>
+                        </wps:cNvPr>
+                        <wps:cNvSpPr txBox="1"/>
+                        <wps:spPr>
+                          <a:xfrm>
+                            <a:off x="62811" y="1062118"/>
+                            <a:ext cx="482209" cy="276999"/>
+                          </a:xfrm>
+                          <a:prstGeom prst="rect">
+                            <a:avLst/>
+                          </a:prstGeom>
+                          <a:noFill/>
+                        </wps:spPr>
+                        <wps:txbx>
+                          <w:txbxContent>
+                            <w:p>
+                              <w:pPr>
+                                <w:pStyle w:val="NormalWeb"/>
+                                <w:spacing w:before="0" w:beforeAutospacing="0" w:after="0" w:afterAutospacing="0"/>
+                              </w:pPr>
+                              <w:r>
+                                <w:rPr>
+                                  <w:rFonts w:asciiTheme="minorHAnsi" w:hAnsi="Calibri" w:cstheme="minorBidi"/>
+                                  <w:color w:val="000000" w:themeColor="text1"/>
+                                  <w:kern w:val="24"/>
+                                </w:rPr>
+                                <w:t>NC</w:t>
+                              </w:r>
+                            </w:p>
+                          </w:txbxContent>
+                        </wps:txbx>
+                        <wps:bodyPr wrap="square" rtlCol="0">
+                          <a:spAutoFit/>
+                        </wps:bodyPr>
+                      </wps:wsp>
+                      <wps:wsp>
+                        <wps:cNvPr id="89" name="ZoneTexte 61">
+                          <a:extLst/>
+                        </wps:cNvPr>
+                        <wps:cNvSpPr txBox="1"/>
+                        <wps:spPr>
+                          <a:xfrm>
+                            <a:off x="32408" y="1247538"/>
+                            <a:ext cx="482209" cy="276999"/>
+                          </a:xfrm>
+                          <a:prstGeom prst="rect">
+                            <a:avLst/>
+                          </a:prstGeom>
+                          <a:noFill/>
+                        </wps:spPr>
+                        <wps:txbx>
+                          <w:txbxContent>
+                            <w:p>
+                              <w:pPr>
+                                <w:pStyle w:val="NormalWeb"/>
+                                <w:spacing w:before="0" w:beforeAutospacing="0" w:after="0" w:afterAutospacing="0"/>
+                              </w:pPr>
+                              <w:r>
+                                <w:rPr>
+                                  <w:rFonts w:asciiTheme="minorHAnsi" w:hAnsi="Calibri" w:cstheme="minorBidi"/>
+                                  <w:color w:val="000000" w:themeColor="text1"/>
+                                  <w:kern w:val="24"/>
+                                </w:rPr>
+                                <w:t>GND</w:t>
+                              </w:r>
+                            </w:p>
+                          </w:txbxContent>
+                        </wps:txbx>
+                        <wps:bodyPr wrap="square" rtlCol="0">
+                          <a:spAutoFit/>
+                        </wps:bodyPr>
+                      </wps:wsp>
+                      <wps:wsp>
+                        <wps:cNvPr id="90" name="ZoneTexte 62">
+                          <a:extLst/>
+                        </wps:cNvPr>
+                        <wps:cNvSpPr txBox="1"/>
+                        <wps:spPr>
+                          <a:xfrm>
+                            <a:off x="62811" y="1424561"/>
+                            <a:ext cx="482209" cy="276999"/>
+                          </a:xfrm>
+                          <a:prstGeom prst="rect">
+                            <a:avLst/>
+                          </a:prstGeom>
+                          <a:noFill/>
+                        </wps:spPr>
+                        <wps:txbx>
+                          <w:txbxContent>
+                            <w:p>
+                              <w:pPr>
+                                <w:pStyle w:val="NormalWeb"/>
+                                <w:spacing w:before="0" w:beforeAutospacing="0" w:after="0" w:afterAutospacing="0"/>
+                              </w:pPr>
+                              <w:r>
+                                <w:rPr>
+                                  <w:rFonts w:asciiTheme="minorHAnsi" w:hAnsi="Calibri" w:cstheme="minorBidi"/>
+                                  <w:color w:val="000000" w:themeColor="text1"/>
+                                  <w:kern w:val="24"/>
+                                </w:rPr>
+                                <w:t>NC</w:t>
+                              </w:r>
+                            </w:p>
+                          </w:txbxContent>
+                        </wps:txbx>
+                        <wps:bodyPr wrap="square" rtlCol="0">
+                          <a:spAutoFit/>
+                        </wps:bodyPr>
+                      </wps:wsp>
+                      <wps:wsp>
+                        <wps:cNvPr id="91" name="ZoneTexte 63">
+                          <a:extLst/>
+                        </wps:cNvPr>
+                        <wps:cNvSpPr txBox="1"/>
+                        <wps:spPr>
+                          <a:xfrm>
+                            <a:off x="1140876" y="1424560"/>
+                            <a:ext cx="482209" cy="276999"/>
+                          </a:xfrm>
+                          <a:prstGeom prst="rect">
+                            <a:avLst/>
+                          </a:prstGeom>
+                          <a:noFill/>
+                        </wps:spPr>
+                        <wps:txbx>
+                          <w:txbxContent>
+                            <w:p>
+                              <w:pPr>
+                                <w:pStyle w:val="NormalWeb"/>
+                                <w:spacing w:before="0" w:beforeAutospacing="0" w:after="0" w:afterAutospacing="0"/>
+                              </w:pPr>
+                              <w:r>
+                                <w:rPr>
+                                  <w:rFonts w:asciiTheme="minorHAnsi" w:hAnsi="Calibri" w:cstheme="minorBidi"/>
+                                  <w:color w:val="000000" w:themeColor="text1"/>
+                                  <w:kern w:val="24"/>
+                                </w:rPr>
+                                <w:t>NC</w:t>
+                              </w:r>
+                            </w:p>
+                          </w:txbxContent>
+                        </wps:txbx>
+                        <wps:bodyPr wrap="square" rtlCol="0">
+                          <a:spAutoFit/>
+                        </wps:bodyPr>
+                      </wps:wsp>
+                      <wps:wsp>
+                        <wps:cNvPr id="92" name="ZoneTexte 64">
+                          <a:extLst/>
+                        </wps:cNvPr>
+                        <wps:cNvSpPr txBox="1"/>
+                        <wps:spPr>
+                          <a:xfrm>
+                            <a:off x="1139298" y="1247537"/>
+                            <a:ext cx="1924195" cy="276999"/>
+                          </a:xfrm>
+                          <a:prstGeom prst="rect">
+                            <a:avLst/>
+                          </a:prstGeom>
+                          <a:noFill/>
+                        </wps:spPr>
+                        <wps:txbx>
+                          <w:txbxContent>
+                            <w:p>
+                              <w:pPr>
+                                <w:pStyle w:val="NormalWeb"/>
+                                <w:spacing w:before="0" w:beforeAutospacing="0" w:after="0" w:afterAutospacing="0"/>
+                              </w:pPr>
+                              <w:r>
+                                <w:rPr>
+                                  <w:rFonts w:asciiTheme="minorHAnsi" w:hAnsi="Calibri" w:cstheme="minorBidi"/>
+                                  <w:color w:val="000000" w:themeColor="text1"/>
+                                  <w:kern w:val="24"/>
+                                </w:rPr>
+                                <w:t>ROUE_MOTEUR_2_PWM_1</w:t>
+                              </w:r>
+                            </w:p>
+                          </w:txbxContent>
+                        </wps:txbx>
+                        <wps:bodyPr wrap="square" rtlCol="0">
+                          <a:spAutoFit/>
+                        </wps:bodyPr>
+                      </wps:wsp>
+                      <wps:wsp>
+                        <wps:cNvPr id="93" name="ZoneTexte 65">
+                          <a:extLst/>
+                        </wps:cNvPr>
+                        <wps:cNvSpPr txBox="1"/>
+                        <wps:spPr>
+                          <a:xfrm>
+                            <a:off x="1131454" y="1060373"/>
+                            <a:ext cx="1924195" cy="276999"/>
+                          </a:xfrm>
+                          <a:prstGeom prst="rect">
+                            <a:avLst/>
+                          </a:prstGeom>
+                          <a:noFill/>
+                        </wps:spPr>
+                        <wps:txbx>
+                          <w:txbxContent>
+                            <w:p>
+                              <w:pPr>
+                                <w:pStyle w:val="NormalWeb"/>
+                                <w:spacing w:before="0" w:beforeAutospacing="0" w:after="0" w:afterAutospacing="0"/>
+                              </w:pPr>
+                              <w:r>
+                                <w:rPr>
+                                  <w:rFonts w:asciiTheme="minorHAnsi" w:hAnsi="Calibri" w:cstheme="minorBidi"/>
+                                  <w:color w:val="000000" w:themeColor="text1"/>
+                                  <w:kern w:val="24"/>
+                                </w:rPr>
+                                <w:t>ROUE_MOTEUR_1_PWM_0</w:t>
+                              </w:r>
+                            </w:p>
+                          </w:txbxContent>
+                        </wps:txbx>
+                        <wps:bodyPr wrap="square" rtlCol="0">
+                          <a:spAutoFit/>
+                        </wps:bodyPr>
+                      </wps:wsp>
+                      <wps:wsp>
+                        <wps:cNvPr id="94" name="ZoneTexte 66">
+                          <a:extLst/>
+                        </wps:cNvPr>
+                        <wps:cNvSpPr txBox="1"/>
+                        <wps:spPr>
+                          <a:xfrm>
+                            <a:off x="1131453" y="883350"/>
+                            <a:ext cx="2328280" cy="276999"/>
+                          </a:xfrm>
+                          <a:prstGeom prst="rect">
+                            <a:avLst/>
+                          </a:prstGeom>
+                          <a:noFill/>
+                        </wps:spPr>
+                        <wps:txbx>
+                          <w:txbxContent>
+                            <w:p>
+                              <w:pPr>
+                                <w:pStyle w:val="NormalWeb"/>
+                                <w:spacing w:before="0" w:beforeAutospacing="0" w:after="0" w:afterAutospacing="0"/>
+                              </w:pPr>
+                              <w:r>
+                                <w:rPr>
+                                  <w:rFonts w:asciiTheme="minorHAnsi" w:hAnsi="Calibri" w:cstheme="minorBidi"/>
+                                  <w:color w:val="000000" w:themeColor="text1"/>
+                                  <w:kern w:val="24"/>
+                                </w:rPr>
+                                <w:t>ROUE_MOTEUR_2_ENCODEUR_B</w:t>
+                              </w:r>
+                            </w:p>
+                          </w:txbxContent>
+                        </wps:txbx>
+                        <wps:bodyPr wrap="square" rtlCol="0">
+                          <a:spAutoFit/>
+                        </wps:bodyPr>
+                      </wps:wsp>
+                      <wps:wsp>
+                        <wps:cNvPr id="95" name="ZoneTexte 67">
+                          <a:extLst/>
+                        </wps:cNvPr>
+                        <wps:cNvSpPr txBox="1"/>
+                        <wps:spPr>
+                          <a:xfrm>
+                            <a:off x="1131452" y="698147"/>
+                            <a:ext cx="2328280" cy="276999"/>
+                          </a:xfrm>
+                          <a:prstGeom prst="rect">
+                            <a:avLst/>
+                          </a:prstGeom>
+                          <a:noFill/>
+                        </wps:spPr>
+                        <wps:txbx>
+                          <w:txbxContent>
+                            <w:p>
+                              <w:pPr>
+                                <w:pStyle w:val="NormalWeb"/>
+                                <w:spacing w:before="0" w:beforeAutospacing="0" w:after="0" w:afterAutospacing="0"/>
+                              </w:pPr>
+                              <w:r>
+                                <w:rPr>
+                                  <w:rFonts w:asciiTheme="minorHAnsi" w:hAnsi="Calibri" w:cstheme="minorBidi"/>
+                                  <w:color w:val="000000" w:themeColor="text1"/>
+                                  <w:kern w:val="24"/>
+                                </w:rPr>
+                                <w:t>ROUE_MOTEUR_2_ENCODEUR_A</w:t>
+                              </w:r>
+                            </w:p>
+                          </w:txbxContent>
+                        </wps:txbx>
+                        <wps:bodyPr wrap="square" rtlCol="0">
+                          <a:spAutoFit/>
+                        </wps:bodyPr>
+                      </wps:wsp>
+                      <wps:wsp>
+                        <wps:cNvPr id="96" name="ZoneTexte 68">
+                          <a:extLst/>
+                        </wps:cNvPr>
+                        <wps:cNvSpPr txBox="1"/>
+                        <wps:spPr>
+                          <a:xfrm>
+                            <a:off x="1131452" y="485175"/>
+                            <a:ext cx="2328280" cy="276999"/>
+                          </a:xfrm>
+                          <a:prstGeom prst="rect">
+                            <a:avLst/>
+                          </a:prstGeom>
+                          <a:noFill/>
+                        </wps:spPr>
+                        <wps:txbx>
+                          <w:txbxContent>
+                            <w:p>
+                              <w:pPr>
+                                <w:pStyle w:val="NormalWeb"/>
+                                <w:spacing w:before="0" w:beforeAutospacing="0" w:after="0" w:afterAutospacing="0"/>
+                              </w:pPr>
+                              <w:r>
+                                <w:rPr>
+                                  <w:rFonts w:asciiTheme="minorHAnsi" w:hAnsi="Calibri" w:cstheme="minorBidi"/>
+                                  <w:color w:val="000000" w:themeColor="text1"/>
+                                  <w:kern w:val="24"/>
+                                </w:rPr>
+                                <w:t>ROUE_MOTEUR_1_ENCODEUR_B</w:t>
+                              </w:r>
+                            </w:p>
+                          </w:txbxContent>
+                        </wps:txbx>
+                        <wps:bodyPr wrap="square" rtlCol="0">
+                          <a:spAutoFit/>
+                        </wps:bodyPr>
+                      </wps:wsp>
+                      <wps:wsp>
+                        <wps:cNvPr id="97" name="ZoneTexte 69">
+                          <a:extLst/>
+                        </wps:cNvPr>
+                        <wps:cNvSpPr txBox="1"/>
+                        <wps:spPr>
+                          <a:xfrm>
+                            <a:off x="1131452" y="295717"/>
+                            <a:ext cx="2328280" cy="276999"/>
+                          </a:xfrm>
+                          <a:prstGeom prst="rect">
+                            <a:avLst/>
+                          </a:prstGeom>
+                          <a:noFill/>
+                        </wps:spPr>
+                        <wps:txbx>
+                          <w:txbxContent>
+                            <w:p>
+                              <w:pPr>
+                                <w:pStyle w:val="NormalWeb"/>
+                                <w:spacing w:before="0" w:beforeAutospacing="0" w:after="0" w:afterAutospacing="0"/>
+                              </w:pPr>
+                              <w:r>
+                                <w:rPr>
+                                  <w:rFonts w:asciiTheme="minorHAnsi" w:hAnsi="Calibri" w:cstheme="minorBidi"/>
+                                  <w:color w:val="000000" w:themeColor="text1"/>
+                                  <w:kern w:val="24"/>
+                                </w:rPr>
+                                <w:t>ROUE_MOTEUR_1_ENCODEUR_A</w:t>
+                              </w:r>
+                            </w:p>
+                          </w:txbxContent>
+                        </wps:txbx>
+                        <wps:bodyPr wrap="square" rtlCol="0">
+                          <a:spAutoFit/>
+                        </wps:bodyPr>
+                      </wps:wsp>
+                    </wpg:wgp>
+                  </a:graphicData>
+                </a:graphic>
+              </wp:anchor>
+            </w:drawing>
+          </mc:Choice>
+          <mc:Fallback>
+            <w:pict>
+              <v:group w14:anchorId="68E18DCA" id="Groupe 2" o:spid="_x0000_s1067" style="position:absolute;margin-left:123pt;margin-top:11.25pt;width:272.4pt;height:160.05pt;z-index:251675648" coordsize="34597,20327" o:gfxdata="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">
+                <v:shape id="Image 83" o:spid="_x0000_s1068" type="#_x0000_t75" style="position:absolute;left:4650;width:7163;height:20327;visibility:visible;mso-wrap-style:square" o:gfxdata="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">
+                  <v:imagedata r:id="rId13" o:title="" croptop="33279f" cropbottom="3064f" cropleft="1440f" cropright="59108f"/>
+                </v:shape>
+                <v:shape id="ZoneTexte 56" o:spid="_x0000_s1069" type="#_x0000_t202" style="position:absolute;left:569;top:2997;width:4116;height:2770;visibility:visible;mso-wrap-style:square;v-text-anchor:top" o:gfxdata="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" filled="f" stroked="f">
+                  <v:textbox style="mso-fit-shape-to-text:t">
+                    <w:txbxContent>
+                      <w:p>
+                        <w:pPr>
+                          <w:pStyle w:val="NormalWeb"/>
+                          <w:spacing w:before="0" w:beforeAutospacing="0" w:after="0" w:afterAutospacing="0"/>
+                        </w:pPr>
+                        <w:r>
+                          <w:rPr>
+                            <w:rFonts w:asciiTheme="minorHAnsi" w:hAnsi="Calibri" w:cstheme="minorBidi"/>
+                            <w:color w:val="000000" w:themeColor="text1"/>
+                            <w:kern w:val="24"/>
+                          </w:rPr>
+                          <w:t>NC</w:t>
+                        </w:r>
+                      </w:p>
+                    </w:txbxContent>
+                  </v:textbox>
+                </v:shape>
+                <v:shape id="ZoneTexte 57" o:spid="_x0000_s1070" type="#_x0000_t202" style="position:absolute;left:942;top:4851;width:4115;height:2770;visibility:visible;mso-wrap-style:square;v-text-anchor:top" o:gfxdata="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" filled="f" stroked="f">
+                  <v:textbox style="mso-fit-shape-to-text:t">
+                    <w:txbxContent>
+                      <w:p>
+                        <w:pPr>
+                          <w:pStyle w:val="NormalWeb"/>
+                          <w:spacing w:before="0" w:beforeAutospacing="0" w:after="0" w:afterAutospacing="0"/>
+                        </w:pPr>
+                        <w:r>
+                          <w:rPr>
+                            <w:rFonts w:asciiTheme="minorHAnsi" w:hAnsi="Calibri" w:cstheme="minorBidi"/>
+                            <w:color w:val="000000" w:themeColor="text1"/>
+                            <w:kern w:val="24"/>
+                          </w:rPr>
+                          <w:t>5V</w:t>
+                        </w:r>
+                      </w:p>
+                    </w:txbxContent>
+                  </v:textbox>
+                </v:shape>
+                <v:shape id="ZoneTexte 58" o:spid="_x0000_s1071" type="#_x0000_t202" style="position:absolute;top:6782;width:4822;height:2770;visibility:visible;mso-wrap-style:square;v-text-anchor:top" o:gfxdata="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" filled="f" stroked="f">
+                  <v:textbox style="mso-fit-shape-to-text:t">
+                    <w:txbxContent>
+                      <w:p>
+                        <w:pPr>
+                          <w:pStyle w:val="NormalWeb"/>
+                          <w:spacing w:before="0" w:beforeAutospacing="0" w:after="0" w:afterAutospacing="0"/>
+                        </w:pPr>
+                        <w:r>
+                          <w:rPr>
+                            <w:rFonts w:asciiTheme="minorHAnsi" w:hAnsi="Calibri" w:cstheme="minorBidi"/>
+                            <w:color w:val="000000" w:themeColor="text1"/>
+                            <w:kern w:val="24"/>
+                          </w:rPr>
+                          <w:t>GND</w:t>
+                        </w:r>
+                      </w:p>
+                    </w:txbxContent>
+                  </v:textbox>
+                </v:shape>
+                <v:shape id="ZoneTexte 59" o:spid="_x0000_s1072" type="#_x0000_t202" style="position:absolute;left:628;top:8701;width:4822;height:2770;visibility:visible;mso-wrap-style:square;v-text-anchor:top" o:gfxdata="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" filled="f" stroked="f">
+                  <v:textbox style="mso-fit-shape-to-text:t">
+                    <w:txbxContent>
+                      <w:p>
+                        <w:pPr>
+                          <w:pStyle w:val="NormalWeb"/>
+                          <w:spacing w:before="0" w:beforeAutospacing="0" w:after="0" w:afterAutospacing="0"/>
+                        </w:pPr>
+                        <w:r>
+                          <w:rPr>
+                            <w:rFonts w:asciiTheme="minorHAnsi" w:hAnsi="Calibri" w:cstheme="minorBidi"/>
+                            <w:color w:val="000000" w:themeColor="text1"/>
+                            <w:kern w:val="24"/>
+                          </w:rPr>
+                          <w:t>NC</w:t>
+                        </w:r>
+                      </w:p>
+                    </w:txbxContent>
+                  </v:textbox>
+                </v:shape>
+                <v:shape id="ZoneTexte 60" o:spid="_x0000_s1073" type="#_x0000_t202" style="position:absolute;left:628;top:10621;width:4822;height:2770;visibility:visible;mso-wrap-style:square;v-text-anchor:top" o:gfxdata="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" filled="f" stroked="f">
+                  <v:textbox style="mso-fit-shape-to-text:t">
+                    <w:txbxContent>
+                      <w:p>
+                        <w:pPr>
+                          <w:pStyle w:val="NormalWeb"/>
+                          <w:spacing w:before="0" w:beforeAutospacing="0" w:after="0" w:afterAutospacing="0"/>
+                        </w:pPr>
+                        <w:r>
+                          <w:rPr>
+                            <w:rFonts w:asciiTheme="minorHAnsi" w:hAnsi="Calibri" w:cstheme="minorBidi"/>
+                            <w:color w:val="000000" w:themeColor="text1"/>
+                            <w:kern w:val="24"/>
+                          </w:rPr>
+                          <w:t>NC</w:t>
+                        </w:r>
+                      </w:p>
+                    </w:txbxContent>
+                  </v:textbox>
+                </v:shape>
+                <v:shape id="ZoneTexte 61" o:spid="_x0000_s1074" type="#_x0000_t202" style="position:absolute;left:324;top:12475;width:4822;height:2770;visibility:visible;mso-wrap-style:square;v-text-anchor:top" o:gfxdata="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" filled="f" stroked="f">
+                  <v:textbox style="mso-fit-shape-to-text:t">
+                    <w:txbxContent>
+                      <w:p>
+                        <w:pPr>
+                          <w:pStyle w:val="NormalWeb"/>
+                          <w:spacing w:before="0" w:beforeAutospacing="0" w:after="0" w:afterAutospacing="0"/>
+                        </w:pPr>
+                        <w:r>
+                          <w:rPr>
+                            <w:rFonts w:asciiTheme="minorHAnsi" w:hAnsi="Calibri" w:cstheme="minorBidi"/>
+                            <w:color w:val="000000" w:themeColor="text1"/>
+                            <w:kern w:val="24"/>
+                          </w:rPr>
+                          <w:t>GND</w:t>
+                        </w:r>
+                      </w:p>
+                    </w:txbxContent>
+                  </v:textbox>
+                </v:shape>
+                <v:shape id="ZoneTexte 62" o:spid="_x0000_s1075" type="#_x0000_t202" style="position:absolute;left:628;top:14245;width:4822;height:2770;visibility:visible;mso-wrap-style:square;v-text-anchor:top" o:gfxdata="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" filled="f" stroked="f">
+                  <v:textbox style="mso-fit-shape-to-text:t">
+                    <w:txbxContent>
+                      <w:p>
+                        <w:pPr>
+                          <w:pStyle w:val="NormalWeb"/>
+                          <w:spacing w:before="0" w:beforeAutospacing="0" w:after="0" w:afterAutospacing="0"/>
+                        </w:pPr>
+                        <w:r>
+                          <w:rPr>
+                            <w:rFonts w:asciiTheme="minorHAnsi" w:hAnsi="Calibri" w:cstheme="minorBidi"/>
+                            <w:color w:val="000000" w:themeColor="text1"/>
+                            <w:kern w:val="24"/>
+                          </w:rPr>
+                          <w:t>NC</w:t>
+                        </w:r>
+                      </w:p>
+                    </w:txbxContent>
+                  </v:textbox>
+                </v:shape>
+                <v:shape id="ZoneTexte 63" o:spid="_x0000_s1076" type="#_x0000_t202" style="position:absolute;left:11408;top:14245;width:4822;height:2770;visibility:visible;mso-wrap-style:square;v-text-anchor:top" o:gfxdata="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" filled="f" stroked="f">
+                  <v:textbox style="mso-fit-shape-to-text:t">
+                    <w:txbxContent>
+                      <w:p>
+                        <w:pPr>
+                          <w:pStyle w:val="NormalWeb"/>
+                          <w:spacing w:before="0" w:beforeAutospacing="0" w:after="0" w:afterAutospacing="0"/>
+                        </w:pPr>
+                        <w:r>
+                          <w:rPr>
+                            <w:rFonts w:asciiTheme="minorHAnsi" w:hAnsi="Calibri" w:cstheme="minorBidi"/>
+                            <w:color w:val="000000" w:themeColor="text1"/>
+                            <w:kern w:val="24"/>
+                          </w:rPr>
+                          <w:t>NC</w:t>
+                        </w:r>
+                      </w:p>
+                    </w:txbxContent>
+                  </v:textbox>
+                </v:shape>
+                <v:shape id="ZoneTexte 64" o:spid="_x0000_s1077" type="#_x0000_t202" style="position:absolute;left:11392;top:12475;width:19242;height:2770;visibility:visible;mso-wrap-style:square;v-text-anchor:top" o:gfxdata="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" filled="f" stroked="f">
+                  <v:textbox style="mso-fit-shape-to-text:t">
+                    <w:txbxContent>
+                      <w:p>
+                        <w:pPr>
+                          <w:pStyle w:val="NormalWeb"/>
+                          <w:spacing w:before="0" w:beforeAutospacing="0" w:after="0" w:afterAutospacing="0"/>
+                        </w:pPr>
+                        <w:r>
+                          <w:rPr>
+                            <w:rFonts w:asciiTheme="minorHAnsi" w:hAnsi="Calibri" w:cstheme="minorBidi"/>
+                            <w:color w:val="000000" w:themeColor="text1"/>
+                            <w:kern w:val="24"/>
+                          </w:rPr>
+                          <w:t>ROUE_MOTEUR_2_PWM_1</w:t>
+                        </w:r>
+                      </w:p>
+                    </w:txbxContent>
+                  </v:textbox>
+                </v:shape>
+                <v:shape id="ZoneTexte 65" o:spid="_x0000_s1078" type="#_x0000_t202" style="position:absolute;left:11314;top:10603;width:19242;height:2770;visibility:visible;mso-wrap-style:square;v-text-anchor:top" o:gfxdata="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" filled="f" stroked="f">
+                  <v:textbox style="mso-fit-shape-to-text:t">
+                    <w:txbxContent>
+                      <w:p>
+                        <w:pPr>
+                          <w:pStyle w:val="NormalWeb"/>
+                          <w:spacing w:before="0" w:beforeAutospacing="0" w:after="0" w:afterAutospacing="0"/>
+                        </w:pPr>
+                        <w:r>
+                          <w:rPr>
+                            <w:rFonts w:asciiTheme="minorHAnsi" w:hAnsi="Calibri" w:cstheme="minorBidi"/>
+                            <w:color w:val="000000" w:themeColor="text1"/>
+                            <w:kern w:val="24"/>
+                          </w:rPr>
+                          <w:t>ROUE_MOTEUR_1_PWM_0</w:t>
+                        </w:r>
+                      </w:p>
+                    </w:txbxContent>
+                  </v:textbox>
+                </v:shape>
+                <v:shape id="ZoneTexte 66" o:spid="_x0000_s1079" type="#_x0000_t202" style="position:absolute;left:11314;top:8833;width:23283;height:2770;visibility:visible;mso-wrap-style:square;v-text-anchor:top" o:gfxdata="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" filled="f" stroked="f">
+                  <v:textbox style="mso-fit-shape-to-text:t">
+                    <w:txbxContent>
+                      <w:p>
+                        <w:pPr>
+                          <w:pStyle w:val="NormalWeb"/>
+                          <w:spacing w:before="0" w:beforeAutospacing="0" w:after="0" w:afterAutospacing="0"/>
+                        </w:pPr>
+                        <w:r>
+                          <w:rPr>
+                            <w:rFonts w:asciiTheme="minorHAnsi" w:hAnsi="Calibri" w:cstheme="minorBidi"/>
+                            <w:color w:val="000000" w:themeColor="text1"/>
+                            <w:kern w:val="24"/>
+                          </w:rPr>
+                          <w:t>ROUE_MOTEUR_2_ENCODEUR_B</w:t>
+                        </w:r>
+                      </w:p>
+                    </w:txbxContent>
+                  </v:textbox>
+                </v:shape>
+                <v:shape id="ZoneTexte 67" o:spid="_x0000_s1080" type="#_x0000_t202" style="position:absolute;left:11314;top:6981;width:23283;height:2770;visibility:visible;mso-wrap-style:square;v-text-anchor:top" o:gfxdata="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" filled="f" stroked="f">
+                  <v:textbox style="mso-fit-shape-to-text:t">
+                    <w:txbxContent>
+                      <w:p>
+                        <w:pPr>
+                          <w:pStyle w:val="NormalWeb"/>
+                          <w:spacing w:before="0" w:beforeAutospacing="0" w:after="0" w:afterAutospacing="0"/>
+                        </w:pPr>
+                        <w:r>
+                          <w:rPr>
+                            <w:rFonts w:asciiTheme="minorHAnsi" w:hAnsi="Calibri" w:cstheme="minorBidi"/>
+                            <w:color w:val="000000" w:themeColor="text1"/>
+                            <w:kern w:val="24"/>
+                          </w:rPr>
+                          <w:t>ROUE_MOTEUR_2_ENCODEUR_A</w:t>
+                        </w:r>
+                      </w:p>
+                    </w:txbxContent>
+                  </v:textbox>
+                </v:shape>
+                <v:shape id="ZoneTexte 68" o:spid="_x0000_s1081" type="#_x0000_t202" style="position:absolute;left:11314;top:4851;width:23283;height:2770;visibility:visible;mso-wrap-style:square;v-text-anchor:top" o:gfxdata="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" filled="f" stroked="f">
+                  <v:textbox style="mso-fit-shape-to-text:t">
+                    <w:txbxContent>
+                      <w:p>
+                        <w:pPr>
+                          <w:pStyle w:val="NormalWeb"/>
+                          <w:spacing w:before="0" w:beforeAutospacing="0" w:after="0" w:afterAutospacing="0"/>
+                        </w:pPr>
+                        <w:r>
+                          <w:rPr>
+                            <w:rFonts w:asciiTheme="minorHAnsi" w:hAnsi="Calibri" w:cstheme="minorBidi"/>
+                            <w:color w:val="000000" w:themeColor="text1"/>
+                            <w:kern w:val="24"/>
+                          </w:rPr>
+                          <w:t>ROUE_MOTEUR_1_ENCODEUR_B</w:t>
+                        </w:r>
+                      </w:p>
+                    </w:txbxContent>
+                  </v:textbox>
+                </v:shape>
+                <v:shape id="ZoneTexte 69" o:spid="_x0000_s1082" type="#_x0000_t202" style="position:absolute;left:11314;top:2957;width:23283;height:2770;visibility:visible;mso-wrap-style:square;v-text-anchor:top" o:gfxdata="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" filled="f" stroked="f">
+                  <v:textbox style="mso-fit-shape-to-text:t">
+                    <w:txbxContent>
+                      <w:p>
+                        <w:pPr>
+                          <w:pStyle w:val="NormalWeb"/>
+                          <w:spacing w:before="0" w:beforeAutospacing="0" w:after="0" w:afterAutospacing="0"/>
+                        </w:pPr>
+                        <w:r>
+                          <w:rPr>
+                            <w:rFonts w:asciiTheme="minorHAnsi" w:hAnsi="Calibri" w:cstheme="minorBidi"/>
+                            <w:color w:val="000000" w:themeColor="text1"/>
+                            <w:kern w:val="24"/>
+                          </w:rPr>
+                          <w:t>ROUE_MOTEUR_1_ENCODEUR_A</w:t>
+                        </w:r>
+                      </w:p>
+                    </w:txbxContent>
+                  </v:textbox>
+                </v:shape>
+              </v:group>
+            </w:pict>
+          </mc:Fallback>
+        </mc:AlternateContent>
+      </w:r>
+    </w:p>
+    <w:p/>
+    <w:p>
       <w:bookmarkStart w:id="0" w:name="_GoBack"/>
-      <w:bookmarkEnd w:id="0"/>
-      <w:r>
-        <w:t xml:space="preserve"> Roues</w:t>
-      </w:r>
-    </w:p>
-    <w:p/>
-    <w:p/>
-    <w:p/>
-    <w:p/>
+      <w:r>
+        <w:br w:type="page"/>
+      </w:r>
+    </w:p>
+    <w:bookmarkEnd w:id="0"/>
     <w:p>
       <w:pPr>
         <w:pStyle w:val="Titre3"/>
       </w:pPr>
       <w:r>
+        <w:lastRenderedPageBreak/>
         <w:t xml:space="preserve">Lanceur </w:t>
       </w:r>
     </w:p>
@@ -2934,29 +4194,43 @@
       <w:r>
         <w:t xml:space="preserve"> nous utilisons le port C qui est situé </w:t>
       </w:r>
-      <w:proofErr w:type="gramStart"/>
-      <w:r>
-        <w:t>a</w:t>
-      </w:r>
-      <w:proofErr w:type="gramEnd"/>
-      <w:r>
-        <w:t xml:space="preserve"> l’arriéré de la MyRIO.</w:t>
-      </w:r>
-    </w:p>
-    <w:p>
-      <w:r>
+      <w:r>
+        <w:t>à</w:t>
+      </w:r>
+      <w:r>
+        <w:t xml:space="preserve"> l’arriéré de la </w:t>
+      </w:r>
+      <w:proofErr w:type="spellStart"/>
+      <w:r>
+        <w:t>MyRIO</w:t>
+      </w:r>
+      <w:proofErr w:type="spellEnd"/>
+      <w:r>
+        <w:t>.</w:t>
+      </w:r>
+    </w:p>
+    <w:p>
+      <w:r>
+        <w:t xml:space="preserve">Le manège du lanceur utilise un servo moteur de type S4306R </w:t>
+      </w:r>
+    </w:p>
+    <w:p>
+      <w:r>
+        <w:rPr>
+          <w:noProof/>
+        </w:rPr>
         <mc:AlternateContent>
           <mc:Choice Requires="wpg">
             <w:drawing>
               <wp:anchor distT="0" distB="0" distL="114300" distR="114300" simplePos="0" relativeHeight="251671552" behindDoc="0" locked="0" layoutInCell="1" allowOverlap="1" wp14:anchorId="2828A22A" wp14:editId="39E1F3DC">
                 <wp:simplePos x="0" y="0"/>
                 <wp:positionH relativeFrom="column">
-                  <wp:posOffset>264459</wp:posOffset>
+                  <wp:posOffset>408305</wp:posOffset>
                 </wp:positionH>
                 <wp:positionV relativeFrom="paragraph">
-                  <wp:posOffset>170330</wp:posOffset>
+                  <wp:posOffset>111586</wp:posOffset>
                 </wp:positionV>
-                <wp:extent cx="4320292" cy="1165860"/>
+                <wp:extent cx="4319905" cy="1165860"/>
                 <wp:effectExtent l="0" t="0" r="0" b="0"/>
                 <wp:wrapNone/>
                 <wp:docPr id="54" name="Groupe 47">
@@ -2970,7 +4244,7 @@
                       <wpg:grpSpPr>
                         <a:xfrm>
                           <a:off x="0" y="0"/>
-                          <a:ext cx="4320292" cy="1165860"/>
+                          <a:ext cx="4319905" cy="1165860"/>
                           <a:chOff x="0" y="0"/>
                           <a:chExt cx="4320292" cy="1165860"/>
                         </a:xfrm>
@@ -3340,9 +4614,9 @@
           </mc:Choice>
           <mc:Fallback>
             <w:pict>
-              <v:group w14:anchorId="2828A22A" id="Groupe 47" o:spid="_x0000_s1061" style="position:absolute;margin-left:20.8pt;margin-top:13.4pt;width:340.2pt;height:91.8pt;z-index:251671552" coordsize="43202,11658" o:gfxdata="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">
-                <v:group id="Groupe 55" o:spid="_x0000_s1062" style="position:absolute;width:28208;height:11658" coordsize="28208,11658" o:gfxdata="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">
-                  <v:shape id="ZoneTexte 6" o:spid="_x0000_s1063" type="#_x0000_t202" style="position:absolute;left:15095;top:2718;width:4547;height:2462;visibility:visible;mso-wrap-style:square;v-text-anchor:top" o:gfxdata="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" filled="f" stroked="f">
+              <v:group w14:anchorId="2828A22A" id="Groupe 47" o:spid="_x0000_s1083" style="position:absolute;margin-left:32.15pt;margin-top:8.8pt;width:340.15pt;height:91.8pt;z-index:251671552" coordsize="43202,11658" o:gfxdata="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">
+                <v:group id="Groupe 55" o:spid="_x0000_s1084" style="position:absolute;width:28208;height:11658" coordsize="28208,11658" o:gfxdata="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">
+                  <v:shape id="ZoneTexte 6" o:spid="_x0000_s1085" type="#_x0000_t202" style="position:absolute;left:15095;top:2718;width:4547;height:2462;visibility:visible;mso-wrap-style:square;v-text-anchor:top" o:gfxdata="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" filled="f" stroked="f">
                     <v:textbox style="mso-fit-shape-to-text:t">
                       <w:txbxContent>
                         <w:p>
@@ -3364,7 +4638,7 @@
                       </w:txbxContent>
                     </v:textbox>
                   </v:shape>
-                  <v:shape id="ZoneTexte 35" o:spid="_x0000_s1064" type="#_x0000_t202" style="position:absolute;left:15681;top:3985;width:3468;height:2462;visibility:visible;mso-wrap-style:square;v-text-anchor:top" o:gfxdata="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" filled="f" stroked="f">
+                  <v:shape id="ZoneTexte 35" o:spid="_x0000_s1086" type="#_x0000_t202" style="position:absolute;left:15681;top:3985;width:3468;height:2462;visibility:visible;mso-wrap-style:square;v-text-anchor:top" o:gfxdata="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" filled="f" stroked="f">
                     <v:textbox style="mso-fit-shape-to-text:t">
                       <w:txbxContent>
                         <w:p>
@@ -3386,10 +4660,10 @@
                       </w:txbxContent>
                     </v:textbox>
                   </v:shape>
-                  <v:shape id="Image 58" o:spid="_x0000_s1065" type="#_x0000_t75" style="position:absolute;left:19072;width:4546;height:11658;visibility:visible;mso-wrap-style:square" o:gfxdata="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">
+                  <v:shape id="Image 58" o:spid="_x0000_s1087" type="#_x0000_t75" style="position:absolute;left:19072;width:4546;height:11658;visibility:visible;mso-wrap-style:square" o:gfxdata="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">
                     <v:imagedata r:id="rId14" o:title="" croptop="6895f" cropbottom="36318f" cropleft="3349f" cropright="57907f"/>
                   </v:shape>
-                  <v:shape id="ZoneTexte 41" o:spid="_x0000_s1066" type="#_x0000_t202" style="position:absolute;left:23661;top:2718;width:4547;height:2462;visibility:visible;mso-wrap-style:square;v-text-anchor:top" o:gfxdata="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" filled="f" stroked="f">
+                  <v:shape id="ZoneTexte 41" o:spid="_x0000_s1088" type="#_x0000_t202" style="position:absolute;left:23661;top:2718;width:4547;height:2462;visibility:visible;mso-wrap-style:square;v-text-anchor:top" o:gfxdata="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" filled="f" stroked="f">
                     <v:textbox style="mso-fit-shape-to-text:t">
                       <w:txbxContent>
                         <w:p>
@@ -3411,7 +4685,7 @@
                       </w:txbxContent>
                     </v:textbox>
                   </v:shape>
-                  <v:shape id="ZoneTexte 42" o:spid="_x0000_s1067" type="#_x0000_t202" style="position:absolute;left:24106;top:3985;width:3468;height:2462;visibility:visible;mso-wrap-style:square;v-text-anchor:top" o:gfxdata="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" filled="f" stroked="f">
+                  <v:shape id="ZoneTexte 42" o:spid="_x0000_s1089" type="#_x0000_t202" style="position:absolute;left:24106;top:3985;width:3468;height:2462;visibility:visible;mso-wrap-style:square;v-text-anchor:top" o:gfxdata="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" filled="f" stroked="f">
                     <v:textbox style="mso-fit-shape-to-text:t">
                       <w:txbxContent>
                         <w:p>
@@ -3433,7 +4707,7 @@
                       </w:txbxContent>
                     </v:textbox>
                   </v:shape>
-                  <v:shape id="ZoneTexte 43" o:spid="_x0000_s1068" type="#_x0000_t202" style="position:absolute;top:9047;width:19584;height:2462;visibility:visible;mso-wrap-style:square;v-text-anchor:top" o:gfxdata="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" filled="f" stroked="f">
+                  <v:shape id="ZoneTexte 43" o:spid="_x0000_s1090" type="#_x0000_t202" style="position:absolute;top:9047;width:19584;height:2462;visibility:visible;mso-wrap-style:square;v-text-anchor:top" o:gfxdata="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" filled="f" stroked="f">
                     <v:textbox style="mso-fit-shape-to-text:t">
                       <w:txbxContent>
                         <w:p>
@@ -3489,7 +4763,7 @@
                       </w:txbxContent>
                     </v:textbox>
                   </v:shape>
-                  <v:shape id="ZoneTexte 44" o:spid="_x0000_s1069" type="#_x0000_t202" style="position:absolute;left:3234;top:5418;width:16438;height:2463;visibility:visible;mso-wrap-style:square;v-text-anchor:top" o:gfxdata="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" filled="f" stroked="f">
+                  <v:shape id="ZoneTexte 44" o:spid="_x0000_s1091" type="#_x0000_t202" style="position:absolute;left:3234;top:5418;width:16438;height:2463;visibility:visible;mso-wrap-style:square;v-text-anchor:top" o:gfxdata="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" filled="f" stroked="f">
                     <v:textbox style="mso-fit-shape-to-text:t">
                       <w:txbxContent>
                         <w:p>
@@ -3524,7 +4798,7 @@
                     </v:textbox>
                   </v:shape>
                 </v:group>
-                <v:shape id="ZoneTexte 45" o:spid="_x0000_s1070" type="#_x0000_t202" style="position:absolute;left:23618;top:5418;width:19584;height:2463;visibility:visible;mso-wrap-style:square;v-text-anchor:top" o:gfxdata="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" filled="f" stroked="f">
+                <v:shape id="ZoneTexte 45" o:spid="_x0000_s1092" type="#_x0000_t202" style="position:absolute;left:23618;top:5418;width:19584;height:2463;visibility:visible;mso-wrap-style:square;v-text-anchor:top" o:gfxdata="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" filled="f" stroked="f">
                   <v:textbox style="mso-fit-shape-to-text:t">
                     <w:txbxContent>
                       <w:p>
@@ -3553,16 +4827,15 @@
           </mc:Fallback>
         </mc:AlternateContent>
       </w:r>
-    </w:p>
-    <w:p/>
-    <w:p/>
-    <w:p/>
-    <w:p/>
-    <w:p/>
-    <w:p>
-      <w:pPr>
-        <w:pStyle w:val="Titre3"/>
-      </w:pPr>
+      <w:r>
+        <w:br w:type="page"/>
+      </w:r>
+    </w:p>
+    <w:p>
+      <w:r>
+        <w:lastRenderedPageBreak/>
+        <w:t xml:space="preserve">  </w:t>
+      </w:r>
       <w:r>
         <w:t xml:space="preserve">Sorties +5V </w:t>
       </w:r>
@@ -3572,6 +4845,9 @@
     </w:p>
     <w:p>
       <w:r>
+        <w:rPr>
+          <w:noProof/>
+        </w:rPr>
         <mc:AlternateContent>
           <mc:Choice Requires="wpg">
             <w:drawing>
@@ -3820,8 +5096,8 @@
           </mc:Choice>
           <mc:Fallback>
             <w:pict>
-              <v:group w14:anchorId="59E3FC08" id="Groupe 22" o:spid="_x0000_s1071" style="position:absolute;margin-left:102.05pt;margin-top:16.55pt;width:176pt;height:60.8pt;z-index:251665408;mso-width-relative:margin;mso-height-relative:margin" coordsize="14851,4619" o:gfxdata="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">
-                <v:shape id="ZoneTexte 4" o:spid="_x0000_s1072" type="#_x0000_t202" style="position:absolute;left:11;width:3544;height:2769;visibility:visible;mso-wrap-style:square;v-text-anchor:top" o:gfxdata="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" filled="f" stroked="f">
+              <v:group w14:anchorId="59E3FC08" id="Groupe 22" o:spid="_x0000_s1093" style="position:absolute;margin-left:102.05pt;margin-top:16.55pt;width:176pt;height:60.8pt;z-index:251665408;mso-width-relative:margin;mso-height-relative:margin" coordsize="14851,4619" o:gfxdata="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">
+                <v:shape id="ZoneTexte 4" o:spid="_x0000_s1094" type="#_x0000_t202" style="position:absolute;left:11;width:3544;height:2769;visibility:visible;mso-wrap-style:square;v-text-anchor:top" o:gfxdata="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" filled="f" stroked="f">
                   <v:textbox>
                     <w:txbxContent>
                       <w:p>
@@ -3841,7 +5117,7 @@
                     </w:txbxContent>
                   </v:textbox>
                 </v:shape>
-                <v:shape id="ZoneTexte 6" o:spid="_x0000_s1073" type="#_x0000_t202" style="position:absolute;top:2157;width:4546;height:2462;visibility:visible;mso-wrap-style:square;v-text-anchor:top" o:gfxdata="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" filled="f" stroked="f">
+                <v:shape id="ZoneTexte 6" o:spid="_x0000_s1095" type="#_x0000_t202" style="position:absolute;top:2157;width:4546;height:2462;visibility:visible;mso-wrap-style:square;v-text-anchor:top" o:gfxdata="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" filled="f" stroked="f">
                   <v:textbox>
                     <w:txbxContent>
                       <w:p>
@@ -3863,13 +5139,13 @@
                     </w:txbxContent>
                   </v:textbox>
                 </v:shape>
-                <v:shape id="Image 32" o:spid="_x0000_s1074" type="#_x0000_t75" style="position:absolute;left:4546;top:749;width:5842;height:3276;visibility:visible;mso-wrap-style:square" o:gfxdata="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">
+                <v:shape id="Image 32" o:spid="_x0000_s1096" type="#_x0000_t75" style="position:absolute;left:4546;top:749;width:5842;height:3276;visibility:visible;mso-wrap-style:square" o:gfxdata="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">
                   <v:imagedata r:id="rId13" o:title="" croptop="52313f" cropbottom="3334f" cropleft="47146f" cropright="10039f"/>
                 </v:shape>
-                <v:line id="Connecteur droit 33" o:spid="_x0000_s1075" style="position:absolute;visibility:visible;mso-wrap-style:square" from="1218,2311" to="13151,2311" o:connectortype="straight" o:gfxdata="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" strokecolor="#4472c4 [3204]" strokeweight=".5pt">
+                <v:line id="Connecteur droit 33" o:spid="_x0000_s1097" style="position:absolute;visibility:visible;mso-wrap-style:square" from="1218,2311" to="13151,2311" o:connectortype="straight" o:gfxdata="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" strokecolor="#4472c4 [3204]" strokeweight=".5pt">
                   <v:stroke joinstyle="miter"/>
                 </v:line>
-                <v:shape id="ZoneTexte 20" o:spid="_x0000_s1076" type="#_x0000_t202" style="position:absolute;left:10599;width:3543;height:2769;visibility:visible;mso-wrap-style:square;v-text-anchor:top" o:gfxdata="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" filled="f" stroked="f">
+                <v:shape id="ZoneTexte 20" o:spid="_x0000_s1098" type="#_x0000_t202" style="position:absolute;left:10599;width:3543;height:2769;visibility:visible;mso-wrap-style:square;v-text-anchor:top" o:gfxdata="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" filled="f" stroked="f">
                   <v:textbox>
                     <w:txbxContent>
                       <w:p>
@@ -3889,7 +5165,7 @@
                     </w:txbxContent>
                   </v:textbox>
                 </v:shape>
-                <v:shape id="ZoneTexte 21" o:spid="_x0000_s1077" type="#_x0000_t202" style="position:absolute;left:10304;top:2157;width:4547;height:2462;visibility:visible;mso-wrap-style:square;v-text-anchor:top" o:gfxdata="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" filled="f" stroked="f">
+                <v:shape id="ZoneTexte 21" o:spid="_x0000_s1099" type="#_x0000_t202" style="position:absolute;left:10304;top:2157;width:4547;height:2462;visibility:visible;mso-wrap-style:square;v-text-anchor:top" o:gfxdata="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" filled="f" stroked="f">
                   <v:textbox>
                     <w:txbxContent>
                       <w:p>

</xml_diff>